<commit_message>
replace the mou doc templates
</commit_message>
<xml_diff>
--- a/mou_templates/mou_international.docx
+++ b/mou_templates/mou_international.docx
@@ -219,48 +219,61 @@
       <w:pPr>
         <w:jc w:val="center"/>
         <w:rPr>
+          <w:del w:id="0" w:author="Yves" w:date="2024-05-15T21:36:00Z"/>
           <w:b/>
           <w:caps/>
         </w:rPr>
       </w:pPr>
-      <w:r>
-        <w:rPr>
-          <w:b/>
-          <w:caps/>
-          <w:highlight w:val="yellow"/>
-        </w:rPr>
-        <w:t>[</w:t>
-      </w:r>
-      <w:r>
-        <w:rPr>
-          <w:b/>
-          <w:caps/>
-          <w:highlight w:val="yellow"/>
-        </w:rPr>
-        <w:t xml:space="preserve"> </w:t>
-      </w:r>
-      <w:r>
-        <w:rPr>
-          <w:b/>
-          <w:caps/>
-          <w:highlight w:val="yellow"/>
-        </w:rPr>
-        <w:t>proposed institution</w:t>
-      </w:r>
-      <w:r>
-        <w:rPr>
-          <w:b/>
-          <w:caps/>
-        </w:rPr>
-        <w:t>………………………………</w:t>
-      </w:r>
-      <w:r>
-        <w:rPr>
-          <w:b/>
-          <w:caps/>
-        </w:rPr>
-        <w:t>]</w:t>
-      </w:r>
+      <w:ins w:id="1" w:author="Yves" w:date="2024-05-15T21:36:00Z">
+        <w:r>
+          <w:rPr>
+            <w:b/>
+            <w:caps/>
+            <w:highlight w:val="yellow"/>
+          </w:rPr>
+          <w:t>{ORGANIZATION_NAME}</w:t>
+        </w:r>
+      </w:ins>
+      <w:del w:id="2" w:author="Yves" w:date="2024-05-15T21:36:00Z">
+        <w:r>
+          <w:rPr>
+            <w:b/>
+            <w:caps/>
+            <w:highlight w:val="yellow"/>
+          </w:rPr>
+          <w:delText>[</w:delText>
+        </w:r>
+        <w:r>
+          <w:rPr>
+            <w:b/>
+            <w:caps/>
+            <w:highlight w:val="yellow"/>
+          </w:rPr>
+          <w:delText xml:space="preserve"> </w:delText>
+        </w:r>
+        <w:r>
+          <w:rPr>
+            <w:b/>
+            <w:caps/>
+            <w:highlight w:val="yellow"/>
+          </w:rPr>
+          <w:delText>proposed institution</w:delText>
+        </w:r>
+        <w:r>
+          <w:rPr>
+            <w:b/>
+            <w:caps/>
+          </w:rPr>
+          <w:delText>………………………………</w:delText>
+        </w:r>
+        <w:r>
+          <w:rPr>
+            <w:b/>
+            <w:caps/>
+          </w:rPr>
+          <w:delText>]</w:delText>
+        </w:r>
+      </w:del>
     </w:p>
     <w:p>
       <w:pPr>
@@ -868,45 +881,7 @@
           <w:highlight w:val="yellow"/>
           <w:lang w:val="en-GB"/>
         </w:rPr>
-        <w:t xml:space="preserve">, with </w:t>
-      </w:r>
-      <w:r>
-        <w:rPr>
-          <w:b/>
-          <w:highlight w:val="yellow"/>
-          <w:lang w:val="en-GB"/>
-        </w:rPr>
-        <w:t xml:space="preserve">permanent and </w:t>
-      </w:r>
-      <w:r>
-        <w:rPr>
-          <w:b/>
-          <w:highlight w:val="yellow"/>
-          <w:lang w:val="en-GB"/>
-        </w:rPr>
-        <w:t>reachable</w:t>
-      </w:r>
-      <w:r>
-        <w:rPr>
-          <w:highlight w:val="yellow"/>
-          <w:lang w:val="en-GB"/>
-        </w:rPr>
-        <w:t xml:space="preserve"> contacts in Rwanda and abroad</w:t>
-      </w:r>
-    </w:p>
-    <w:p>
-      <w:pPr>
-        <w:rPr>
-          <w:b/>
-          <w:caps/>
-        </w:rPr>
-      </w:pPr>
-      <w:r>
-        <w:rPr>
-          <w:b/>
-          <w:lang w:val="en-GB"/>
-        </w:rPr>
-        <w:t>………………….</w:t>
+        <w:t>]</w:t>
       </w:r>
     </w:p>
     <w:p>
@@ -1022,6 +997,70 @@
           <w:lang w:val="en-GB"/>
         </w:rPr>
       </w:pPr>
+      <w:r>
+        <w:rPr>
+          <w:lang w:val="en-GB"/>
+        </w:rPr>
+        <w:t>[Complete address abroad]:</w:t>
+      </w:r>
+    </w:p>
+    <w:p>
+      <w:pPr>
+        <w:jc w:val="both"/>
+        <w:rPr>
+          <w:lang w:val="en-GB"/>
+        </w:rPr>
+      </w:pPr>
+      <w:r>
+        <w:rPr>
+          <w:lang w:val="en-GB"/>
+        </w:rPr>
+        <w:t>……………………..</w:t>
+      </w:r>
+    </w:p>
+    <w:p>
+      <w:pPr>
+        <w:jc w:val="both"/>
+        <w:rPr>
+          <w:lang w:val="en-GB"/>
+        </w:rPr>
+      </w:pPr>
+      <w:r>
+        <w:rPr>
+          <w:lang w:val="en-GB"/>
+        </w:rPr>
+        <w:t>…………………..</w:t>
+      </w:r>
+    </w:p>
+    <w:p>
+      <w:pPr>
+        <w:jc w:val="both"/>
+        <w:rPr>
+          <w:lang w:val="en-GB"/>
+        </w:rPr>
+      </w:pPr>
+      <w:r>
+        <w:rPr>
+          <w:lang w:val="en-GB"/>
+        </w:rPr>
+        <w:t>…………………….</w:t>
+      </w:r>
+    </w:p>
+    <w:p>
+      <w:pPr>
+        <w:jc w:val="both"/>
+        <w:rPr>
+          <w:lang w:val="en-GB"/>
+        </w:rPr>
+      </w:pPr>
+    </w:p>
+    <w:p>
+      <w:pPr>
+        <w:jc w:val="both"/>
+        <w:rPr>
+          <w:lang w:val="en-GB"/>
+        </w:rPr>
+      </w:pPr>
     </w:p>
     <w:p>
       <w:pPr>
@@ -1064,8 +1103,14 @@
     <w:p>
       <w:pPr>
         <w:jc w:val="both"/>
-      </w:pPr>
-      <w:r>
+        <w:rPr>
+          <w:lang w:val="fr-FR"/>
+        </w:rPr>
+      </w:pPr>
+      <w:r>
+        <w:rPr>
+          <w:lang w:val="fr-FR"/>
+        </w:rPr>
         <w:t>P.O. Box 84</w:t>
       </w:r>
     </w:p>
@@ -1073,12 +1118,12 @@
       <w:pPr>
         <w:jc w:val="both"/>
         <w:rPr>
-          <w:lang w:val="en-GB"/>
-        </w:rPr>
-      </w:pPr>
-      <w:r>
-        <w:rPr>
-          <w:lang w:val="en-GB"/>
+          <w:lang w:val="fr-FR"/>
+        </w:rPr>
+      </w:pPr>
+      <w:r>
+        <w:rPr>
+          <w:lang w:val="fr-FR"/>
         </w:rPr>
         <w:t>Kigali - Rwanda</w:t>
       </w:r>
@@ -1087,14 +1132,37 @@
       <w:pPr>
         <w:jc w:val="both"/>
         <w:rPr>
-          <w:lang w:val="en-GB"/>
-        </w:rPr>
-      </w:pPr>
-      <w:r>
-        <w:rPr>
-          <w:lang w:val="en-GB"/>
-        </w:rPr>
-        <w:t>Email: info@moh.gov.rw</w:t>
+          <w:lang w:val="fr-FR"/>
+        </w:rPr>
+      </w:pPr>
+      <w:proofErr w:type="gramStart"/>
+      <w:r>
+        <w:rPr>
+          <w:lang w:val="fr-FR"/>
+        </w:rPr>
+        <w:t>Email:</w:t>
+      </w:r>
+      <w:proofErr w:type="gramEnd"/>
+      <w:r>
+        <w:rPr>
+          <w:lang w:val="fr-FR"/>
+        </w:rPr>
+        <w:t xml:space="preserve"> </w:t>
+      </w:r>
+      <w:hyperlink r:id="rId8" w:history="1">
+        <w:r>
+          <w:rPr>
+            <w:rStyle w:val="Hyperlink"/>
+            <w:lang w:val="fr-FR"/>
+          </w:rPr>
+          <w:t>info@moh.gov.rw</w:t>
+        </w:r>
+      </w:hyperlink>
+      <w:r>
+        <w:rPr>
+          <w:lang w:val="fr-FR"/>
+        </w:rPr>
+        <w:t xml:space="preserve"> </w:t>
       </w:r>
     </w:p>
     <w:p>
@@ -1110,7 +1178,7 @@
         </w:rPr>
         <w:t xml:space="preserve">Website: </w:t>
       </w:r>
-      <w:hyperlink r:id="rId8" w:history="1">
+      <w:hyperlink r:id="rId9" w:history="1">
         <w:r>
           <w:rPr>
             <w:rStyle w:val="Hyperlink"/>
@@ -1330,7 +1398,6 @@
         <w:rPr>
           <w:bCs/>
         </w:rPr>
-        <w:lastRenderedPageBreak/>
         <w:t xml:space="preserve">The Program shall </w:t>
       </w:r>
       <w:r>
@@ -1343,21 +1410,11 @@
         <w:rPr>
           <w:bCs/>
         </w:rPr>
-        <w:t xml:space="preserve"> </w:t>
-      </w:r>
-      <w:r>
-        <w:rPr>
-          <w:b/>
-          <w:bCs/>
-          <w:highlight w:val="yellow"/>
-        </w:rPr>
-        <w:t>…………</w:t>
-      </w:r>
-      <w:r>
-        <w:rPr>
-          <w:b/>
-          <w:bCs/>
-          <w:highlight w:val="yellow"/>
+        <w:t xml:space="preserve"> 5 </w:t>
+      </w:r>
+      <w:r>
+        <w:rPr>
+          <w:bCs/>
         </w:rPr>
         <w:t>years</w:t>
       </w:r>
@@ -1428,14 +1485,30 @@
       <w:r>
         <w:rPr>
           <w:bCs/>
-        </w:rPr>
-        <w:t xml:space="preserve">two (2) </w:t>
-      </w:r>
-      <w:r>
-        <w:rPr>
-          <w:bCs/>
-        </w:rPr>
-        <w:t>years</w:t>
+          <w:highlight w:val="cyan"/>
+        </w:rPr>
+        <w:t>one (1</w:t>
+      </w:r>
+      <w:r>
+        <w:rPr>
+          <w:bCs/>
+          <w:highlight w:val="cyan"/>
+        </w:rPr>
+        <w:t xml:space="preserve">) </w:t>
+      </w:r>
+      <w:r>
+        <w:rPr>
+          <w:bCs/>
+          <w:highlight w:val="cyan"/>
+        </w:rPr>
+        <w:t>y</w:t>
+      </w:r>
+      <w:r>
+        <w:rPr>
+          <w:bCs/>
+          <w:highlight w:val="cyan"/>
+        </w:rPr>
+        <w:t>ear</w:t>
       </w:r>
       <w:r>
         <w:rPr>
@@ -1758,144 +1831,67 @@
     </w:p>
     <w:p>
       <w:pPr>
+        <w:ind w:left="648"/>
+        <w:jc w:val="both"/>
+      </w:pPr>
+    </w:p>
+    <w:p>
+      <w:pPr>
         <w:numPr>
           <w:ilvl w:val="0"/>
           <w:numId w:val="8"/>
         </w:numPr>
         <w:jc w:val="both"/>
-        <w:rPr>
-          <w:highlight w:val="green"/>
-        </w:rPr>
-      </w:pPr>
-      <w:r>
-        <w:rPr>
-          <w:highlight w:val="green"/>
-        </w:rPr>
-        <w:t>To</w:t>
-      </w:r>
-      <w:r>
-        <w:rPr>
-          <w:highlight w:val="green"/>
-        </w:rPr>
+      </w:pPr>
+      <w:r>
+        <w:t xml:space="preserve">To </w:t>
+      </w:r>
+      <w:r>
+        <w:t xml:space="preserve">provide supervision and </w:t>
+      </w:r>
+      <w:r>
+        <w:t>inform</w:t>
+      </w:r>
+      <w:r>
         <w:t xml:space="preserve"> </w:t>
       </w:r>
       <w:r>
-        <w:rPr>
-          <w:highlight w:val="green"/>
-        </w:rPr>
-        <w:t>…………….</w:t>
-      </w:r>
-    </w:p>
-    <w:p>
-      <w:pPr>
-        <w:ind w:left="648"/>
-        <w:jc w:val="both"/>
-        <w:rPr>
-          <w:highlight w:val="green"/>
-        </w:rPr>
-      </w:pPr>
-    </w:p>
-    <w:p>
-      <w:pPr>
-        <w:numPr>
-          <w:ilvl w:val="0"/>
-          <w:numId w:val="8"/>
-        </w:numPr>
-        <w:jc w:val="both"/>
-        <w:rPr>
-          <w:highlight w:val="green"/>
-        </w:rPr>
-      </w:pPr>
-      <w:r>
-        <w:rPr>
-          <w:highlight w:val="green"/>
-        </w:rPr>
-        <w:t>To</w:t>
-      </w:r>
-      <w:r>
-        <w:rPr>
-          <w:highlight w:val="green"/>
-        </w:rPr>
+        <w:t>[</w:t>
+      </w:r>
+      <w:r>
+        <w:rPr>
+          <w:highlight w:val="yellow"/>
+        </w:rPr>
+        <w:t>Proposed institution</w:t>
+      </w:r>
+      <w:proofErr w:type="gramStart"/>
+      <w:r>
+        <w:rPr>
+          <w:highlight w:val="yellow"/>
+        </w:rPr>
+        <w:t>…..</w:t>
+      </w:r>
+      <w:proofErr w:type="gramEnd"/>
+      <w:r>
+        <w:rPr>
+          <w:highlight w:val="yellow"/>
+        </w:rPr>
+        <w:t>]</w:t>
+      </w:r>
+      <w:r>
         <w:t xml:space="preserve"> </w:t>
       </w:r>
       <w:r>
-        <w:rPr>
-          <w:highlight w:val="green"/>
-        </w:rPr>
-        <w:t>………………………</w:t>
-      </w:r>
-      <w:proofErr w:type="gramStart"/>
-      <w:r>
-        <w:rPr>
-          <w:highlight w:val="green"/>
-        </w:rPr>
-        <w:t>…..</w:t>
-      </w:r>
-      <w:proofErr w:type="gramEnd"/>
-    </w:p>
-    <w:p>
-      <w:pPr>
-        <w:ind w:left="648"/>
-        <w:jc w:val="both"/>
-      </w:pPr>
-    </w:p>
-    <w:p>
-      <w:pPr>
-        <w:numPr>
-          <w:ilvl w:val="0"/>
-          <w:numId w:val="8"/>
-        </w:numPr>
-        <w:jc w:val="both"/>
-      </w:pPr>
-      <w:r>
-        <w:t xml:space="preserve">To </w:t>
-      </w:r>
-      <w:r>
-        <w:t xml:space="preserve">provide supervision and will </w:t>
-      </w:r>
-      <w:r>
-        <w:t>inform</w:t>
+        <w:t>of any concerns or changes in the National Health Policy</w:t>
       </w:r>
       <w:r>
         <w:t xml:space="preserve"> </w:t>
       </w:r>
       <w:r>
+        <w:t xml:space="preserve">where </w:t>
+      </w:r>
+      <w:r>
         <w:t>[</w:t>
-      </w:r>
-      <w:r>
-        <w:rPr>
-          <w:highlight w:val="yellow"/>
-        </w:rPr>
-        <w:t>Proposed institution</w:t>
-      </w:r>
-      <w:proofErr w:type="gramStart"/>
-      <w:r>
-        <w:rPr>
-          <w:highlight w:val="yellow"/>
-        </w:rPr>
-        <w:t>…..</w:t>
-      </w:r>
-      <w:proofErr w:type="gramEnd"/>
-      <w:r>
-        <w:rPr>
-          <w:highlight w:val="yellow"/>
-        </w:rPr>
-        <w:t>]</w:t>
-      </w:r>
-      <w:r>
-        <w:t xml:space="preserve"> </w:t>
-      </w:r>
-      <w:r>
-        <w:t>of any concerns or changes in the National Health Policy</w:t>
-      </w:r>
-      <w:r>
-        <w:t xml:space="preserve"> </w:t>
-      </w:r>
-      <w:r>
-        <w:t xml:space="preserve">where </w:t>
-      </w:r>
-      <w:r>
-        <w:t>………….. [</w:t>
       </w:r>
       <w:r>
         <w:rPr>
@@ -2244,13 +2240,31 @@
         <w:t xml:space="preserve"> </w:t>
       </w:r>
       <w:r>
+        <w:t>(</w:t>
+      </w:r>
+      <w:r>
+        <w:rPr>
+          <w:i/>
+        </w:rPr>
         <w:sym w:font="Wingdings" w:char="F0E8"/>
       </w:r>
       <w:r>
-        <w:t>Here you</w:t>
-      </w:r>
-      <w:r>
-        <w:t xml:space="preserve"> have to provide detailed activities</w:t>
+        <w:rPr>
+          <w:i/>
+        </w:rPr>
+        <w:t>Please</w:t>
+      </w:r>
+      <w:r>
+        <w:rPr>
+          <w:i/>
+        </w:rPr>
+        <w:t xml:space="preserve"> provide </w:t>
+      </w:r>
+      <w:r>
+        <w:rPr>
+          <w:i/>
+        </w:rPr>
+        <w:t>the list of interventions here)</w:t>
       </w:r>
     </w:p>
     <w:p>
@@ -2463,7 +2477,13 @@
     </w:p>
     <w:p>
       <w:r>
-        <w:t xml:space="preserve">Both Parties shall be joint owners of any intellectual property rights in data or materials generated during the course of project activities. With regard to data collected in Rwanda, the MOH is free to further develop, publish, share or otherwise use such data or material, but </w:t>
+        <w:t>Both Parties shall be joint owners of any intellectual property rights in data or materials generated during the course of project activities. With regard to data collected in Rwanda, the MOH is free to further develop, publish, share</w:t>
+      </w:r>
+      <w:r>
+        <w:t>,</w:t>
+      </w:r>
+      <w:r>
+        <w:t xml:space="preserve"> or otherwise use such data or material, but </w:t>
       </w:r>
       <w:r>
         <w:rPr>
@@ -2660,13 +2680,33 @@
         <w:t>, if</w:t>
       </w:r>
       <w:r>
-        <w:t>……</w:t>
-      </w:r>
-      <w:r>
-        <w:t>..........</w:t>
-      </w:r>
-      <w:r>
-        <w:t xml:space="preserve"> does not register </w:t>
+        <w:t xml:space="preserve"> </w:t>
+      </w:r>
+      <w:r>
+        <w:rPr>
+          <w:highlight w:val="yellow"/>
+        </w:rPr>
+        <w:t xml:space="preserve">[Proposed </w:t>
+      </w:r>
+      <w:proofErr w:type="gramStart"/>
+      <w:r>
+        <w:rPr>
+          <w:highlight w:val="yellow"/>
+        </w:rPr>
+        <w:t>institution]</w:t>
+      </w:r>
+      <w:r>
+        <w:t xml:space="preserve"> </w:t>
+      </w:r>
+      <w:r>
+        <w:t xml:space="preserve"> </w:t>
+      </w:r>
+      <w:r>
+        <w:t xml:space="preserve"> </w:t>
+      </w:r>
+      <w:proofErr w:type="gramEnd"/>
+      <w:r>
+        <w:t xml:space="preserve">does not register </w:t>
       </w:r>
       <w:r>
         <w:t xml:space="preserve">or renew its registration certificate </w:t>
@@ -2815,7 +2855,7 @@
           <w:b w:val="0"/>
           <w:szCs w:val="24"/>
         </w:rPr>
-        <w:t>such consent acknowledged this</w:t>
+        <w:t>such consent acknowledge</w:t>
       </w:r>
       <w:r>
         <w:rPr>
@@ -2823,7 +2863,7 @@
           <w:b w:val="0"/>
           <w:szCs w:val="24"/>
         </w:rPr>
-        <w:t xml:space="preserve"> ................................</w:t>
+        <w:t>s</w:t>
       </w:r>
       <w:r>
         <w:rPr>
@@ -2831,7 +2871,7 @@
           <w:b w:val="0"/>
           <w:szCs w:val="24"/>
         </w:rPr>
-        <w:t xml:space="preserve"> 2</w:t>
+        <w:t xml:space="preserve"> this</w:t>
       </w:r>
       <w:r>
         <w:rPr>
@@ -2839,7 +2879,7 @@
           <w:b w:val="0"/>
           <w:szCs w:val="24"/>
         </w:rPr>
-        <w:t>0</w:t>
+        <w:t xml:space="preserve"> </w:t>
       </w:r>
       <w:r>
         <w:rPr>
@@ -2847,7 +2887,7 @@
           <w:b w:val="0"/>
           <w:szCs w:val="24"/>
         </w:rPr>
-        <w:t>2</w:t>
+        <w:t>(Date/Month/Year)</w:t>
       </w:r>
       <w:r>
         <w:rPr>
@@ -2855,14 +2895,6 @@
           <w:b w:val="0"/>
           <w:szCs w:val="24"/>
         </w:rPr>
-        <w:t>3</w:t>
-      </w:r>
-      <w:r>
-        <w:rPr>
-          <w:rFonts w:ascii="Times New Roman" w:hAnsi="Times New Roman"/>
-          <w:b w:val="0"/>
-          <w:szCs w:val="24"/>
-        </w:rPr>
         <w:t>.</w:t>
       </w:r>
     </w:p>
@@ -2877,15 +2909,93 @@
         <w:jc w:val="center"/>
         <w:rPr>
           <w:rStyle w:val="description"/>
-        </w:rPr>
-      </w:pPr>
-      <w:r>
+          <w:b/>
+          <w:bCs/>
+          <w:u w:val="single"/>
+        </w:rPr>
+      </w:pPr>
+    </w:p>
+    <w:p>
+      <w:pPr>
+        <w:jc w:val="center"/>
         <w:rPr>
           <w:rStyle w:val="description"/>
           <w:b/>
           <w:bCs/>
           <w:u w:val="single"/>
         </w:rPr>
+      </w:pPr>
+    </w:p>
+    <w:p>
+      <w:pPr>
+        <w:jc w:val="center"/>
+        <w:rPr>
+          <w:rStyle w:val="description"/>
+          <w:b/>
+          <w:bCs/>
+          <w:u w:val="single"/>
+        </w:rPr>
+      </w:pPr>
+    </w:p>
+    <w:p>
+      <w:pPr>
+        <w:jc w:val="center"/>
+        <w:rPr>
+          <w:rStyle w:val="description"/>
+          <w:b/>
+          <w:bCs/>
+          <w:u w:val="single"/>
+        </w:rPr>
+      </w:pPr>
+    </w:p>
+    <w:p>
+      <w:pPr>
+        <w:jc w:val="center"/>
+        <w:rPr>
+          <w:rStyle w:val="description"/>
+          <w:b/>
+          <w:bCs/>
+          <w:u w:val="single"/>
+        </w:rPr>
+      </w:pPr>
+    </w:p>
+    <w:p>
+      <w:pPr>
+        <w:jc w:val="center"/>
+        <w:rPr>
+          <w:rStyle w:val="description"/>
+          <w:b/>
+          <w:bCs/>
+          <w:u w:val="single"/>
+        </w:rPr>
+      </w:pPr>
+    </w:p>
+    <w:p>
+      <w:pPr>
+        <w:jc w:val="center"/>
+        <w:rPr>
+          <w:rStyle w:val="description"/>
+          <w:b/>
+          <w:bCs/>
+          <w:u w:val="single"/>
+        </w:rPr>
+      </w:pPr>
+    </w:p>
+    <w:p>
+      <w:pPr>
+        <w:jc w:val="center"/>
+        <w:rPr>
+          <w:rStyle w:val="description"/>
+        </w:rPr>
+      </w:pPr>
+      <w:r>
+        <w:rPr>
+          <w:rStyle w:val="description"/>
+          <w:b/>
+          <w:bCs/>
+          <w:u w:val="single"/>
+        </w:rPr>
+        <w:lastRenderedPageBreak/>
         <w:t>THE PARTIES</w:t>
       </w:r>
     </w:p>
@@ -3128,7 +3238,6 @@
           <w:b/>
           <w:bCs/>
         </w:rPr>
-        <w:lastRenderedPageBreak/>
         <w:tab/>
         <w:t xml:space="preserve">                         </w:t>
       </w:r>
@@ -3419,7 +3528,7 @@
       </w:r>
     </w:p>
     <w:sectPr>
-      <w:footerReference w:type="default" r:id="rId9"/>
+      <w:footerReference w:type="default" r:id="rId10"/>
       <w:pgSz w:w="11909" w:h="16834" w:code="9"/>
       <w:pgMar w:top="851" w:right="1440" w:bottom="709" w:left="1440" w:header="432" w:footer="144" w:gutter="0"/>
       <w:cols w:space="720"/>
@@ -5319,6 +5428,14 @@
     <w:abstractNumId w:val="14"/>
   </w:num>
 </w:numbering>
+</file>
+
+<file path=word/people.xml><?xml version="1.0" encoding="utf-8"?>
+<w15:people xmlns:wpc="http://schemas.microsoft.com/office/word/2010/wordprocessingCanvas" xmlns:cx="http://schemas.microsoft.com/office/drawing/2014/chartex" xmlns:cx1="http://schemas.microsoft.com/office/drawing/2015/9/8/chartex" xmlns:cx2="http://schemas.microsoft.com/office/drawing/2015/10/21/chartex" xmlns:cx3="http://schemas.microsoft.com/office/drawing/2016/5/9/chartex" xmlns:cx4="http://schemas.microsoft.com/office/drawing/2016/5/10/chartex" xmlns:cx5="http://schemas.microsoft.com/office/drawing/2016/5/11/chartex" xmlns:cx6="http://schemas.microsoft.com/office/drawing/2016/5/12/chartex" xmlns:cx7="http://schemas.microsoft.com/office/drawing/2016/5/13/chartex" xmlns:cx8="http://schemas.microsoft.com/office/drawing/2016/5/14/chartex" xmlns:mc="http://schemas.openxmlformats.org/markup-compatibility/2006" xmlns:aink="http://schemas.microsoft.com/office/drawing/2016/ink" xmlns:am3d="http://schemas.microsoft.com/office/drawing/2017/model3d" xmlns:o="urn:schemas-microsoft-com:office:office" xmlns:r="http://schemas.openxmlformats.org/officeDocument/2006/relationships" xmlns:m="http://schemas.openxmlformats.org/officeDocument/2006/math" xmlns:v="urn:schemas-microsoft-com:vml" xmlns:wp14="http://schemas.microsoft.com/office/word/2010/wordprocessingDrawing" xmlns:wp="http://schemas.openxmlformats.org/drawingml/2006/wordprocessingDrawing" xmlns:w10="urn:schemas-microsoft-com:office:word" xmlns:w="http://schemas.openxmlformats.org/wordprocessingml/2006/main" xmlns:w14="http://schemas.microsoft.com/office/word/2010/wordml" xmlns:w15="http://schemas.microsoft.com/office/word/2012/wordml" xmlns:w16cex="http://schemas.microsoft.com/office/word/2018/wordml/cex" xmlns:w16cid="http://schemas.microsoft.com/office/word/2016/wordml/cid" xmlns:w16="http://schemas.microsoft.com/office/word/2018/wordml" xmlns:w16sdtdh="http://schemas.microsoft.com/office/word/2020/wordml/sdtdatahash" xmlns:w16se="http://schemas.microsoft.com/office/word/2015/wordml/symex" xmlns:wpg="http://schemas.microsoft.com/office/word/2010/wordprocessingGroup" xmlns:wpi="http://schemas.microsoft.com/office/word/2010/wordprocessingInk" xmlns:wne="http://schemas.microsoft.com/office/word/2006/wordml" xmlns:wps="http://schemas.microsoft.com/office/word/2010/wordprocessingShape" mc:Ignorable="w14 w15 w16se w16cid w16 w16cex w16sdtdh wp14">
+  <w15:person w15:author="Yves">
+    <w15:presenceInfo w15:providerId="None" w15:userId="Yves"/>
+  </w15:person>
+</w15:people>
 </file>
 
 <file path=word/styles.xml><?xml version="1.0" encoding="utf-8"?>
@@ -5775,7 +5892,6 @@
   <w:style w:type="character" w:default="1" w:styleId="DefaultParagraphFont">
     <w:name w:val="Default Paragraph Font"/>
     <w:uiPriority w:val="1"/>
-    <w:semiHidden/>
     <w:unhideWhenUsed/>
   </w:style>
   <w:style w:type="table" w:default="1" w:styleId="TableNormal">
@@ -6577,7 +6693,7 @@
 </file>
 
 <file path=customXml/itemProps1.xml><?xml version="1.0" encoding="utf-8"?>
-<ds:datastoreItem xmlns:ds="http://schemas.openxmlformats.org/officeDocument/2006/customXml" ds:itemID="{E18E841A-5DE1-4F13-AF8E-0F163ED646EE}">
+<ds:datastoreItem xmlns:ds="http://schemas.openxmlformats.org/officeDocument/2006/customXml" ds:itemID="{24FC5C4D-9518-411B-A38E-811DB6991FC0}">
   <ds:schemaRefs>
     <ds:schemaRef ds:uri="http://schemas.openxmlformats.org/officeDocument/2006/bibliography"/>
   </ds:schemaRefs>

</xml_diff>

<commit_message>
fix: generate correct mou document
</commit_message>
<xml_diff>
--- a/mou_templates/mou_international.docx
+++ b/mou_templates/mou_international.docx
@@ -854,14 +854,12 @@
         </w:rPr>
         <w:t xml:space="preserve"> </w:t>
       </w:r>
-      <w:proofErr w:type="spellStart"/>
       <w:r>
         <w:rPr>
           <w:sz w:val="24"/>
         </w:rPr>
         <w:t>organisation</w:t>
       </w:r>
-      <w:proofErr w:type="spellEnd"/>
       <w:r>
         <w:rPr>
           <w:spacing w:val="40"/>
@@ -1700,177 +1698,9 @@
       <w:pPr>
         <w:spacing w:before="90"/>
         <w:ind w:left="340"/>
-        <w:rPr>
-          <w:b/>
-          <w:i/>
-          <w:sz w:val="24"/>
-        </w:rPr>
-      </w:pPr>
-      <w:r>
-        <w:rPr>
-          <w:color w:val="000000"/>
-          <w:sz w:val="24"/>
-          <w:shd w:val="clear" w:color="auto" w:fill="FFFF00"/>
-        </w:rPr>
-        <w:t>[Partner</w:t>
-      </w:r>
-      <w:r>
-        <w:rPr>
-          <w:color w:val="000000"/>
-          <w:spacing w:val="-4"/>
-          <w:sz w:val="24"/>
-          <w:shd w:val="clear" w:color="auto" w:fill="FFFF00"/>
-        </w:rPr>
-        <w:t xml:space="preserve"> </w:t>
-      </w:r>
-      <w:r>
-        <w:rPr>
-          <w:color w:val="000000"/>
-          <w:sz w:val="24"/>
-          <w:shd w:val="clear" w:color="auto" w:fill="FFFF00"/>
-        </w:rPr>
-        <w:t>Institution]</w:t>
-      </w:r>
-      <w:r>
-        <w:rPr>
-          <w:color w:val="000000"/>
-          <w:spacing w:val="-4"/>
-          <w:sz w:val="24"/>
-          <w:shd w:val="clear" w:color="auto" w:fill="FFFF00"/>
-        </w:rPr>
-        <w:t xml:space="preserve"> </w:t>
-      </w:r>
-      <w:r>
-        <w:rPr>
-          <w:color w:val="000000"/>
-          <w:sz w:val="24"/>
-          <w:shd w:val="clear" w:color="auto" w:fill="FFFF00"/>
-        </w:rPr>
-        <w:t>(</w:t>
-      </w:r>
-      <w:r>
-        <w:rPr>
-          <w:i/>
-          <w:color w:val="000000"/>
-          <w:sz w:val="24"/>
-          <w:shd w:val="clear" w:color="auto" w:fill="FFFF00"/>
-        </w:rPr>
-        <w:t>with</w:t>
-      </w:r>
-      <w:r>
-        <w:rPr>
-          <w:i/>
-          <w:color w:val="000000"/>
-          <w:spacing w:val="-2"/>
-          <w:sz w:val="24"/>
-          <w:shd w:val="clear" w:color="auto" w:fill="FFFF00"/>
-        </w:rPr>
-        <w:t xml:space="preserve"> </w:t>
-      </w:r>
-      <w:r>
-        <w:rPr>
-          <w:b/>
-          <w:i/>
-          <w:color w:val="000000"/>
-          <w:sz w:val="24"/>
-          <w:shd w:val="clear" w:color="auto" w:fill="FFFF00"/>
-        </w:rPr>
-        <w:t>permanent</w:t>
-      </w:r>
-      <w:r>
-        <w:rPr>
-          <w:b/>
-          <w:i/>
-          <w:color w:val="000000"/>
-          <w:spacing w:val="-3"/>
-          <w:sz w:val="24"/>
-          <w:shd w:val="clear" w:color="auto" w:fill="FFFF00"/>
-        </w:rPr>
-        <w:t xml:space="preserve"> </w:t>
-      </w:r>
-      <w:r>
-        <w:rPr>
-          <w:b/>
-          <w:i/>
-          <w:color w:val="000000"/>
-          <w:sz w:val="24"/>
-          <w:shd w:val="clear" w:color="auto" w:fill="FFFF00"/>
-        </w:rPr>
-        <w:t>and</w:t>
-      </w:r>
-      <w:r>
-        <w:rPr>
-          <w:b/>
-          <w:i/>
-          <w:color w:val="000000"/>
-          <w:spacing w:val="-3"/>
-          <w:sz w:val="24"/>
-          <w:shd w:val="clear" w:color="auto" w:fill="FFFF00"/>
-        </w:rPr>
-        <w:t xml:space="preserve"> </w:t>
-      </w:r>
-      <w:r>
-        <w:rPr>
-          <w:b/>
-          <w:i/>
-          <w:color w:val="000000"/>
-          <w:sz w:val="24"/>
-          <w:shd w:val="clear" w:color="auto" w:fill="FFFF00"/>
-        </w:rPr>
-        <w:t>reachable</w:t>
-      </w:r>
-      <w:r>
-        <w:rPr>
-          <w:b/>
-          <w:i/>
-          <w:color w:val="000000"/>
-          <w:spacing w:val="-3"/>
-          <w:sz w:val="24"/>
-          <w:shd w:val="clear" w:color="auto" w:fill="FFFF00"/>
-        </w:rPr>
-        <w:t xml:space="preserve"> </w:t>
-      </w:r>
-      <w:r>
-        <w:rPr>
-          <w:b/>
-          <w:i/>
-          <w:color w:val="000000"/>
-          <w:sz w:val="24"/>
-          <w:shd w:val="clear" w:color="auto" w:fill="FFFF00"/>
-        </w:rPr>
-        <w:t>contacts</w:t>
-      </w:r>
-      <w:r>
-        <w:rPr>
-          <w:b/>
-          <w:i/>
-          <w:color w:val="000000"/>
-          <w:spacing w:val="-3"/>
-          <w:sz w:val="24"/>
-          <w:shd w:val="clear" w:color="auto" w:fill="FFFF00"/>
-        </w:rPr>
-        <w:t xml:space="preserve"> </w:t>
-      </w:r>
-      <w:r>
-        <w:rPr>
-          <w:b/>
-          <w:i/>
-          <w:color w:val="000000"/>
-          <w:sz w:val="24"/>
-          <w:shd w:val="clear" w:color="auto" w:fill="FFFF00"/>
-        </w:rPr>
-        <w:t>in</w:t>
-      </w:r>
-      <w:r>
-        <w:rPr>
-          <w:b/>
-          <w:i/>
-          <w:color w:val="000000"/>
-          <w:spacing w:val="-2"/>
-          <w:sz w:val="24"/>
-          <w:shd w:val="clear" w:color="auto" w:fill="FFFF00"/>
-        </w:rPr>
-        <w:t xml:space="preserve"> Rwanda)</w:t>
+      </w:pPr>
+      <w:r>
+        <w:t>{ORGANIZATION_NAME}</w:t>
       </w:r>
     </w:p>
     <w:p>
@@ -1897,7 +1727,10 @@
         <w:t xml:space="preserve"> </w:t>
       </w:r>
       <w:r>
-        <w:t>…………… Kigali – Rwanda</w:t>
+        <w:t xml:space="preserve">{ORGANIZATION_PO_BOX} </w:t>
+      </w:r>
+      <w:r>
+        <w:t>Kigali – Rwanda</w:t>
       </w:r>
     </w:p>
     <w:p>
@@ -1943,16 +1776,36 @@
         <w:t xml:space="preserve"> </w:t>
       </w:r>
       <w:r>
-        <w:t>……... Address:</w:t>
-      </w:r>
-      <w:r>
-        <w:rPr>
-          <w:spacing w:val="-2"/>
-        </w:rPr>
-        <w:t xml:space="preserve"> </w:t>
-      </w:r>
-      <w:r>
-        <w:t>……………………. Email:</w:t>
+        <w:t>{ORGANIZATION_PHONE}</w:t>
+      </w:r>
+    </w:p>
+    <w:p>
+      <w:pPr>
+        <w:pStyle w:val="BodyText"/>
+        <w:ind w:left="340" w:right="6218"/>
+        <w:jc w:val="both"/>
+      </w:pPr>
+      <w:r>
+        <w:t>Address:</w:t>
+      </w:r>
+      <w:r>
+        <w:rPr>
+          <w:spacing w:val="-2"/>
+        </w:rPr>
+        <w:t xml:space="preserve"> </w:t>
+      </w:r>
+      <w:r>
+        <w:t>{ORGANIZATION_ADDRESS}</w:t>
+      </w:r>
+    </w:p>
+    <w:p>
+      <w:pPr>
+        <w:pStyle w:val="BodyText"/>
+        <w:ind w:left="340" w:right="6218"/>
+        <w:jc w:val="both"/>
+      </w:pPr>
+      <w:r>
+        <w:t>Email:</w:t>
       </w:r>
       <w:r>
         <w:rPr>
@@ -1961,21 +1814,29 @@
         <w:t xml:space="preserve"> </w:t>
       </w:r>
       <w:r>
-        <w:t xml:space="preserve">………………………. </w:t>
-      </w:r>
-      <w:proofErr w:type="gramStart"/>
-      <w:r>
-        <w:rPr>
-          <w:spacing w:val="-2"/>
-        </w:rPr>
-        <w:t>Website:…</w:t>
-      </w:r>
-      <w:proofErr w:type="gramEnd"/>
-      <w:r>
-        <w:rPr>
-          <w:spacing w:val="-2"/>
-        </w:rPr>
-        <w:t>…………………..</w:t>
+        <w:t>{ORGANIZATION_EMAIL}</w:t>
+      </w:r>
+      <w:r>
+        <w:t xml:space="preserve"> </w:t>
+      </w:r>
+    </w:p>
+    <w:p>
+      <w:pPr>
+        <w:pStyle w:val="BodyText"/>
+        <w:ind w:left="340" w:right="6218"/>
+        <w:jc w:val="both"/>
+      </w:pPr>
+      <w:r>
+        <w:rPr>
+          <w:spacing w:val="-2"/>
+        </w:rPr>
+        <w:t>Website</w:t>
+      </w:r>
+      <w:r>
+        <w:rPr>
+          <w:spacing w:val="-2"/>
+        </w:rPr>
+        <w:t>: {ORGANIZATION_WEBSITE}</w:t>
       </w:r>
     </w:p>
     <w:p>
@@ -2173,6 +2034,7 @@
         <w:ind w:left="340"/>
       </w:pPr>
       <w:r>
+        <w:lastRenderedPageBreak/>
         <w:t>Hereinafter</w:t>
       </w:r>
       <w:r>
@@ -2200,15 +2062,7 @@
         <w:t xml:space="preserve"> </w:t>
       </w:r>
       <w:r>
-        <w:t>as “</w:t>
-      </w:r>
-      <w:proofErr w:type="spellStart"/>
-      <w:r>
-        <w:t>MoH</w:t>
-      </w:r>
-      <w:proofErr w:type="spellEnd"/>
-      <w:r>
-        <w:t>”</w:t>
+        <w:t>as “MoH”</w:t>
       </w:r>
       <w:r>
         <w:rPr>
@@ -2355,62 +2209,50 @@
         </w:rPr>
         <w:t xml:space="preserve"> </w:t>
       </w:r>
-      <w:proofErr w:type="gramStart"/>
-      <w:r>
-        <w:t>and</w:t>
-      </w:r>
-      <w:r>
-        <w:rPr>
+      <w:r>
+        <w:t>an</w:t>
+      </w:r>
+      <w:r>
+        <w:t>d {ORGANIZATION_NAME};</w:t>
+      </w:r>
+      <w:r>
+        <w:rPr>
+          <w:color w:val="000000"/>
           <w:spacing w:val="40"/>
         </w:rPr>
         <w:t xml:space="preserve"> </w:t>
       </w:r>
       <w:r>
-        <w:t>.</w:t>
-      </w:r>
-      <w:proofErr w:type="gramEnd"/>
-      <w:r>
-        <w:rPr>
-          <w:color w:val="000000"/>
-          <w:shd w:val="clear" w:color="auto" w:fill="FFFF00"/>
-        </w:rPr>
-        <w:t>[</w:t>
+        <w:rPr>
+          <w:color w:val="000000"/>
+        </w:rPr>
+        <w:t>both</w:t>
       </w:r>
       <w:r>
         <w:rPr>
           <w:color w:val="000000"/>
           <w:spacing w:val="40"/>
-          <w:shd w:val="clear" w:color="auto" w:fill="FFFF00"/>
-        </w:rPr>
-        <w:t xml:space="preserve"> </w:t>
-      </w:r>
-      <w:r>
-        <w:rPr>
-          <w:color w:val="000000"/>
-          <w:shd w:val="clear" w:color="auto" w:fill="FFFF00"/>
-        </w:rPr>
-        <w:t>proposed</w:t>
+        </w:rPr>
+        <w:t xml:space="preserve"> </w:t>
+      </w:r>
+      <w:r>
+        <w:rPr>
+          <w:color w:val="000000"/>
+        </w:rPr>
+        <w:t>parties</w:t>
       </w:r>
       <w:r>
         <w:rPr>
           <w:color w:val="000000"/>
           <w:spacing w:val="40"/>
-          <w:shd w:val="clear" w:color="auto" w:fill="FFFF00"/>
-        </w:rPr>
-        <w:t xml:space="preserve"> </w:t>
-      </w:r>
-      <w:r>
-        <w:rPr>
-          <w:color w:val="000000"/>
-          <w:shd w:val="clear" w:color="auto" w:fill="FFFF00"/>
-        </w:rPr>
-        <w:t>institution</w:t>
-      </w:r>
-      <w:r>
-        <w:rPr>
-          <w:color w:val="000000"/>
-        </w:rPr>
-        <w:t>......................];</w:t>
+        </w:rPr>
+        <w:t xml:space="preserve"> </w:t>
+      </w:r>
+      <w:r>
+        <w:rPr>
+          <w:color w:val="000000"/>
+        </w:rPr>
+        <w:t>agree</w:t>
       </w:r>
       <w:r>
         <w:rPr>
@@ -2423,45 +2265,6 @@
         <w:rPr>
           <w:color w:val="000000"/>
         </w:rPr>
-        <w:t>both</w:t>
-      </w:r>
-      <w:r>
-        <w:rPr>
-          <w:color w:val="000000"/>
-          <w:spacing w:val="40"/>
-        </w:rPr>
-        <w:t xml:space="preserve"> </w:t>
-      </w:r>
-      <w:r>
-        <w:rPr>
-          <w:color w:val="000000"/>
-        </w:rPr>
-        <w:t>parties</w:t>
-      </w:r>
-      <w:r>
-        <w:rPr>
-          <w:color w:val="000000"/>
-          <w:spacing w:val="40"/>
-        </w:rPr>
-        <w:t xml:space="preserve"> </w:t>
-      </w:r>
-      <w:r>
-        <w:rPr>
-          <w:color w:val="000000"/>
-        </w:rPr>
-        <w:t>agree</w:t>
-      </w:r>
-      <w:r>
-        <w:rPr>
-          <w:color w:val="000000"/>
-          <w:spacing w:val="40"/>
-        </w:rPr>
-        <w:t xml:space="preserve"> </w:t>
-      </w:r>
-      <w:r>
-        <w:rPr>
-          <w:color w:val="000000"/>
-        </w:rPr>
         <w:t>to</w:t>
       </w:r>
       <w:r>
@@ -2475,7 +2278,13 @@
         <w:rPr>
           <w:color w:val="000000"/>
         </w:rPr>
-        <w:t>establish a partnership/collaboration in ……………………………………..</w:t>
+        <w:t xml:space="preserve">establish a partnership/collaboration in </w:t>
+      </w:r>
+      <w:r>
+        <w:rPr>
+          <w:color w:val="000000"/>
+        </w:rPr>
+        <w:t>{PROJECT_NAME}</w:t>
       </w:r>
     </w:p>
     <w:p>
@@ -2945,7 +2754,7 @@
         <w:t>is</w:t>
       </w:r>
       <w:r>
-        <w:tab/>
+        <w:t xml:space="preserve"> {OVERALL_GOAL} </w:t>
       </w:r>
       <w:r>
         <w:rPr>
@@ -2987,54 +2796,17 @@
     <w:p>
       <w:pPr>
         <w:pStyle w:val="BodyText"/>
-      </w:pPr>
-    </w:p>
-    <w:p>
-      <w:pPr>
-        <w:pStyle w:val="BodyText"/>
         <w:ind w:left="340"/>
       </w:pPr>
-      <w:r>
-        <w:rPr>
-          <w:spacing w:val="-5"/>
-        </w:rPr>
-        <w:t>1.</w:t>
-      </w:r>
-    </w:p>
-    <w:p>
-      <w:pPr>
-        <w:pStyle w:val="BodyText"/>
-        <w:ind w:left="340"/>
-      </w:pPr>
-      <w:r>
-        <w:rPr>
-          <w:spacing w:val="-5"/>
-        </w:rPr>
-        <w:t>2.</w:t>
-      </w:r>
-    </w:p>
-    <w:p>
-      <w:pPr>
-        <w:ind w:left="340"/>
-        <w:rPr>
-          <w:sz w:val="24"/>
-        </w:rPr>
-      </w:pPr>
-      <w:r>
-        <w:rPr>
-          <w:spacing w:val="-5"/>
-          <w:sz w:val="24"/>
-        </w:rPr>
-        <w:t>….</w:t>
-      </w:r>
-    </w:p>
-    <w:p>
-      <w:pPr>
-        <w:pStyle w:val="BodyText"/>
-        <w:rPr>
-          <w:sz w:val="26"/>
-        </w:rPr>
-      </w:pPr>
+    </w:p>
+    <w:p>
+      <w:pPr>
+        <w:pStyle w:val="BodyText"/>
+        <w:ind w:left="340" w:firstLine="380"/>
+      </w:pPr>
+      <w:r>
+        <w:t>{PROJECT_GOALS}</w:t>
+      </w:r>
     </w:p>
     <w:p>
       <w:pPr>
@@ -3271,7 +3043,20 @@
         <w:rPr>
           <w:sz w:val="24"/>
         </w:rPr>
-        <w:t>To provide supervision and inform [</w:t>
+        <w:t xml:space="preserve">To provide supervision and inform </w:t>
+      </w:r>
+      <w:r>
+        <w:rPr>
+          <w:sz w:val="24"/>
+        </w:rPr>
+        <w:t>{ORGANIZATION_NAME}</w:t>
+      </w:r>
+      <w:r>
+        <w:rPr>
+          <w:color w:val="000000"/>
+          <w:sz w:val="24"/>
+        </w:rPr>
+        <w:t xml:space="preserve"> of any concerns or changes in the National Health Policy where </w:t>
       </w:r>
       <w:r>
         <w:rPr>
@@ -3279,40 +3064,7 @@
           <w:sz w:val="24"/>
           <w:shd w:val="clear" w:color="auto" w:fill="00FFFF"/>
         </w:rPr>
-        <w:t>Proposed institution</w:t>
-      </w:r>
-      <w:proofErr w:type="gramStart"/>
-      <w:r>
-        <w:rPr>
-          <w:color w:val="000000"/>
-          <w:sz w:val="24"/>
-          <w:shd w:val="clear" w:color="auto" w:fill="00FFFF"/>
-        </w:rPr>
-        <w:t>…..</w:t>
-      </w:r>
-      <w:proofErr w:type="gramEnd"/>
-      <w:r>
-        <w:rPr>
-          <w:color w:val="000000"/>
-          <w:sz w:val="24"/>
-          <w:shd w:val="clear" w:color="auto" w:fill="00FFFF"/>
-        </w:rPr>
-        <w:t>]</w:t>
-      </w:r>
-      <w:r>
-        <w:rPr>
-          <w:color w:val="000000"/>
-          <w:sz w:val="24"/>
-        </w:rPr>
-        <w:t xml:space="preserve"> of any concerns or changes in the National Health Policy where </w:t>
-      </w:r>
-      <w:r>
-        <w:rPr>
-          <w:color w:val="000000"/>
-          <w:sz w:val="24"/>
-          <w:shd w:val="clear" w:color="auto" w:fill="00FFFF"/>
-        </w:rPr>
-        <w:t>[partner’s area of intervention]</w:t>
+        <w:t>{ACTIVITIES_DOMAINS}</w:t>
       </w:r>
       <w:r>
         <w:rPr>
@@ -3356,14 +3108,7 @@
           <w:color w:val="000000"/>
           <w:sz w:val="24"/>
         </w:rPr>
-        <w:t>s</w:t>
-      </w:r>
-      <w:r>
-        <w:rPr>
-          <w:color w:val="000000"/>
-          <w:sz w:val="24"/>
-        </w:rPr>
-        <w:t>upport</w:t>
+        <w:t>support</w:t>
       </w:r>
       <w:r>
         <w:rPr>
@@ -3469,23 +3214,6 @@
           <w:sz w:val="24"/>
         </w:rPr>
         <w:t>program</w:t>
-      </w:r>
-      <w:r>
-        <w:rPr>
-          <w:color w:val="000000"/>
-          <w:spacing w:val="-1"/>
-          <w:sz w:val="24"/>
-        </w:rPr>
-        <w:t xml:space="preserve"> </w:t>
-      </w:r>
-      <w:r>
-        <w:rPr>
-          <w:color w:val="000000"/>
-          <w:spacing w:val="-2"/>
-          <w:sz w:val="24"/>
-          <w:shd w:val="clear" w:color="auto" w:fill="00FFFF"/>
-        </w:rPr>
-        <w:t>......................</w:t>
       </w:r>
     </w:p>
     <w:p>
@@ -3507,21 +3235,7 @@
         <w:rPr>
           <w:sz w:val="24"/>
         </w:rPr>
-        <w:t>To assigns Partners/</w:t>
-      </w:r>
-      <w:proofErr w:type="spellStart"/>
-      <w:r>
-        <w:rPr>
-          <w:sz w:val="24"/>
-        </w:rPr>
-        <w:t>SWAp</w:t>
-      </w:r>
-      <w:proofErr w:type="spellEnd"/>
-      <w:r>
-        <w:rPr>
-          <w:sz w:val="24"/>
-        </w:rPr>
-        <w:t xml:space="preserve"> Coordination Desk to provide to </w:t>
+        <w:t xml:space="preserve">To assigns Partners/SWAp Coordination Desk to provide to </w:t>
       </w:r>
       <w:r>
         <w:rPr>
@@ -3529,7 +3243,7 @@
           <w:sz w:val="24"/>
           <w:shd w:val="clear" w:color="auto" w:fill="00FFFF"/>
         </w:rPr>
-        <w:t>[Proposed institution]</w:t>
+        <w:t>{ORGANIZATION_NAME}</w:t>
       </w:r>
       <w:r>
         <w:rPr>
@@ -3605,10 +3319,7 @@
       <w:bookmarkEnd w:id="3"/>
       <w:r>
         <w:lastRenderedPageBreak/>
-        <w:t>Re</w:t>
-      </w:r>
-      <w:r>
-        <w:t>sponsibilities</w:t>
+        <w:t>Responsibilities</w:t>
       </w:r>
       <w:r>
         <w:rPr>
@@ -3630,444 +3341,156 @@
           <w:color w:val="000000"/>
           <w:shd w:val="clear" w:color="auto" w:fill="FFFF00"/>
         </w:rPr>
-        <w:t>[propose</w:t>
-      </w:r>
-      <w:r>
-        <w:rPr>
-          <w:color w:val="000000"/>
-          <w:spacing w:val="-3"/>
-          <w:shd w:val="clear" w:color="auto" w:fill="FFFF00"/>
-        </w:rPr>
-        <w:t xml:space="preserve"> </w:t>
-      </w:r>
-      <w:r>
-        <w:rPr>
-          <w:color w:val="000000"/>
-          <w:shd w:val="clear" w:color="auto" w:fill="FFFF00"/>
-        </w:rPr>
-        <w:t>institution</w:t>
-      </w:r>
-      <w:r>
-        <w:rPr>
-          <w:color w:val="000000"/>
-        </w:rPr>
-        <w:t>,</w:t>
-      </w:r>
-      <w:r>
-        <w:rPr>
-          <w:color w:val="000000"/>
-          <w:spacing w:val="-3"/>
-        </w:rPr>
-        <w:t xml:space="preserve"> </w:t>
-      </w:r>
-      <w:r>
-        <w:rPr>
-          <w:color w:val="000000"/>
-          <w:shd w:val="clear" w:color="auto" w:fill="FFFF00"/>
-        </w:rPr>
-        <w:t>and</w:t>
-      </w:r>
-      <w:r>
-        <w:rPr>
-          <w:color w:val="000000"/>
-          <w:spacing w:val="-2"/>
-          <w:shd w:val="clear" w:color="auto" w:fill="FFFF00"/>
-        </w:rPr>
-        <w:t xml:space="preserve"> </w:t>
-      </w:r>
-      <w:r>
-        <w:rPr>
-          <w:color w:val="000000"/>
-          <w:shd w:val="clear" w:color="auto" w:fill="FFFF00"/>
-        </w:rPr>
-        <w:t>fill</w:t>
-      </w:r>
-      <w:r>
-        <w:rPr>
-          <w:color w:val="000000"/>
-          <w:spacing w:val="-5"/>
-          <w:shd w:val="clear" w:color="auto" w:fill="FFFF00"/>
-        </w:rPr>
-        <w:t xml:space="preserve"> </w:t>
-      </w:r>
-      <w:proofErr w:type="gramStart"/>
-      <w:r>
-        <w:rPr>
-          <w:color w:val="000000"/>
-          <w:shd w:val="clear" w:color="auto" w:fill="FFFF00"/>
+        <w:t>{ORGANIZATION_NAME}</w:t>
+      </w:r>
+    </w:p>
+    <w:p>
+      <w:pPr>
+        <w:pStyle w:val="BodyText"/>
+        <w:rPr>
+          <w:b/>
+        </w:rPr>
+      </w:pPr>
+    </w:p>
+    <w:p>
+      <w:pPr>
+        <w:ind w:left="340"/>
+        <w:rPr>
+          <w:b/>
+          <w:sz w:val="24"/>
+        </w:rPr>
+      </w:pPr>
+      <w:r>
+        <w:rPr>
+          <w:b/>
+          <w:sz w:val="24"/>
+        </w:rPr>
+        <w:t>The</w:t>
+      </w:r>
+      <w:r>
+        <w:rPr>
+          <w:b/>
+          <w:spacing w:val="9"/>
+          <w:sz w:val="24"/>
+        </w:rPr>
+        <w:t xml:space="preserve"> </w:t>
+      </w:r>
+      <w:r>
+        <w:rPr>
+          <w:b/>
+          <w:sz w:val="24"/>
         </w:rPr>
         <w:t>responsibilities</w:t>
       </w:r>
-      <w:proofErr w:type="gramEnd"/>
-      <w:r>
-        <w:rPr>
-          <w:color w:val="000000"/>
-          <w:spacing w:val="-2"/>
-          <w:shd w:val="clear" w:color="auto" w:fill="FFFF00"/>
-        </w:rPr>
-        <w:t xml:space="preserve"> part</w:t>
-      </w:r>
-      <w:r>
-        <w:rPr>
-          <w:color w:val="000000"/>
-          <w:spacing w:val="-2"/>
-        </w:rPr>
-        <w:t>]</w:t>
-      </w:r>
-    </w:p>
-    <w:p>
-      <w:pPr>
-        <w:pStyle w:val="BodyText"/>
-        <w:rPr>
-          <w:b/>
-        </w:rPr>
-      </w:pPr>
-    </w:p>
-    <w:p>
-      <w:pPr>
+      <w:r>
+        <w:rPr>
+          <w:b/>
+          <w:spacing w:val="12"/>
+          <w:sz w:val="24"/>
+        </w:rPr>
+        <w:t xml:space="preserve"> </w:t>
+      </w:r>
+      <w:r>
+        <w:rPr>
+          <w:b/>
+          <w:sz w:val="24"/>
+        </w:rPr>
+        <w:t>of</w:t>
+      </w:r>
+      <w:r>
+        <w:rPr>
+          <w:b/>
+          <w:spacing w:val="11"/>
+          <w:sz w:val="24"/>
+        </w:rPr>
+        <w:t xml:space="preserve"> </w:t>
+      </w:r>
+      <w:r>
+        <w:rPr>
+          <w:b/>
+          <w:sz w:val="24"/>
+        </w:rPr>
+        <w:t xml:space="preserve">{ORGANIZATION_NAME} </w:t>
+      </w:r>
+      <w:r>
+        <w:rPr>
+          <w:b/>
+          <w:sz w:val="24"/>
+        </w:rPr>
+        <w:t>are</w:t>
+      </w:r>
+      <w:r>
+        <w:rPr>
+          <w:b/>
+          <w:spacing w:val="11"/>
+          <w:sz w:val="24"/>
+        </w:rPr>
+        <w:t xml:space="preserve"> </w:t>
+      </w:r>
+      <w:r>
+        <w:rPr>
+          <w:b/>
+          <w:sz w:val="24"/>
+        </w:rPr>
+        <w:t>as</w:t>
+      </w:r>
+      <w:r>
+        <w:rPr>
+          <w:b/>
+          <w:spacing w:val="12"/>
+          <w:sz w:val="24"/>
+        </w:rPr>
+        <w:t xml:space="preserve"> </w:t>
+      </w:r>
+      <w:r>
+        <w:rPr>
+          <w:b/>
+          <w:spacing w:val="-2"/>
+          <w:sz w:val="24"/>
+        </w:rPr>
+        <w:t>follows:</w:t>
+      </w:r>
+    </w:p>
+    <w:p>
+      <w:pPr>
+        <w:pStyle w:val="BodyText"/>
+        <w:rPr>
+          <w:i/>
+        </w:rPr>
+      </w:pPr>
+    </w:p>
+    <w:p>
+      <w:pPr>
+        <w:pStyle w:val="BodyText"/>
         <w:ind w:left="340"/>
         <w:rPr>
-          <w:b/>
-          <w:sz w:val="24"/>
-        </w:rPr>
-      </w:pPr>
-      <w:r>
-        <w:rPr>
-          <w:b/>
-          <w:sz w:val="24"/>
-        </w:rPr>
-        <w:t>The</w:t>
-      </w:r>
-      <w:r>
-        <w:rPr>
-          <w:b/>
-          <w:spacing w:val="9"/>
-          <w:sz w:val="24"/>
-        </w:rPr>
-        <w:t xml:space="preserve"> </w:t>
-      </w:r>
-      <w:r>
-        <w:rPr>
-          <w:b/>
-          <w:sz w:val="24"/>
-        </w:rPr>
-        <w:t>responsibilities</w:t>
-      </w:r>
-      <w:r>
-        <w:rPr>
-          <w:b/>
-          <w:spacing w:val="12"/>
-          <w:sz w:val="24"/>
-        </w:rPr>
-        <w:t xml:space="preserve"> </w:t>
-      </w:r>
-      <w:r>
-        <w:rPr>
-          <w:b/>
-          <w:sz w:val="24"/>
-        </w:rPr>
-        <w:t>of</w:t>
-      </w:r>
-      <w:r>
-        <w:rPr>
-          <w:b/>
-          <w:spacing w:val="11"/>
-          <w:sz w:val="24"/>
-        </w:rPr>
-        <w:t xml:space="preserve"> </w:t>
-      </w:r>
-      <w:r>
-        <w:rPr>
-          <w:b/>
-          <w:sz w:val="24"/>
-        </w:rPr>
-        <w:t>[propose</w:t>
-      </w:r>
-      <w:r>
-        <w:rPr>
-          <w:b/>
-          <w:spacing w:val="11"/>
-          <w:sz w:val="24"/>
-        </w:rPr>
-        <w:t xml:space="preserve"> </w:t>
-      </w:r>
-      <w:r>
-        <w:rPr>
-          <w:b/>
-          <w:sz w:val="24"/>
-        </w:rPr>
-        <w:t>institution,</w:t>
-      </w:r>
-      <w:r>
-        <w:rPr>
-          <w:b/>
-          <w:spacing w:val="12"/>
-          <w:sz w:val="24"/>
-        </w:rPr>
-        <w:t xml:space="preserve"> </w:t>
-      </w:r>
-      <w:r>
-        <w:rPr>
-          <w:b/>
-          <w:sz w:val="24"/>
-        </w:rPr>
-        <w:t>and</w:t>
-      </w:r>
-      <w:r>
-        <w:rPr>
-          <w:b/>
-          <w:spacing w:val="13"/>
-          <w:sz w:val="24"/>
-        </w:rPr>
-        <w:t xml:space="preserve"> </w:t>
-      </w:r>
-      <w:r>
-        <w:rPr>
-          <w:b/>
-          <w:sz w:val="24"/>
-        </w:rPr>
-        <w:t>fill</w:t>
-      </w:r>
-      <w:r>
-        <w:rPr>
-          <w:b/>
-          <w:spacing w:val="11"/>
-          <w:sz w:val="24"/>
-        </w:rPr>
-        <w:t xml:space="preserve"> </w:t>
-      </w:r>
-      <w:proofErr w:type="gramStart"/>
-      <w:r>
-        <w:rPr>
-          <w:b/>
-          <w:sz w:val="24"/>
-        </w:rPr>
-        <w:t>responsibilities</w:t>
-      </w:r>
-      <w:proofErr w:type="gramEnd"/>
-      <w:r>
-        <w:rPr>
-          <w:b/>
-          <w:spacing w:val="12"/>
-          <w:sz w:val="24"/>
-        </w:rPr>
-        <w:t xml:space="preserve"> </w:t>
-      </w:r>
-      <w:r>
-        <w:rPr>
-          <w:b/>
-          <w:sz w:val="24"/>
-        </w:rPr>
-        <w:t>part]</w:t>
-      </w:r>
-      <w:r>
-        <w:rPr>
-          <w:b/>
-          <w:spacing w:val="12"/>
-          <w:sz w:val="24"/>
-        </w:rPr>
-        <w:t xml:space="preserve"> </w:t>
-      </w:r>
-      <w:r>
-        <w:rPr>
-          <w:b/>
-          <w:sz w:val="24"/>
-        </w:rPr>
-        <w:t>are</w:t>
-      </w:r>
-      <w:r>
-        <w:rPr>
-          <w:b/>
-          <w:spacing w:val="11"/>
-          <w:sz w:val="24"/>
-        </w:rPr>
-        <w:t xml:space="preserve"> </w:t>
-      </w:r>
-      <w:r>
-        <w:rPr>
-          <w:b/>
-          <w:sz w:val="24"/>
-        </w:rPr>
-        <w:t>as</w:t>
-      </w:r>
-      <w:r>
-        <w:rPr>
-          <w:b/>
-          <w:spacing w:val="12"/>
-          <w:sz w:val="24"/>
-        </w:rPr>
-        <w:t xml:space="preserve"> </w:t>
-      </w:r>
-      <w:r>
-        <w:rPr>
-          <w:b/>
-          <w:spacing w:val="-2"/>
-          <w:sz w:val="24"/>
-        </w:rPr>
-        <w:t>follows:</w:t>
-      </w:r>
-    </w:p>
-    <w:p>
-      <w:pPr>
+          <w:spacing w:val="-2"/>
+        </w:rPr>
+      </w:pPr>
+      <w:r>
+        <w:rPr>
+          <w:spacing w:val="-2"/>
+        </w:rPr>
+        <w:t>{PARTY_RESPONSIB</w:t>
+      </w:r>
+      <w:r>
+        <w:rPr>
+          <w:spacing w:val="-2"/>
+        </w:rPr>
+        <w:t>I</w:t>
+      </w:r>
+      <w:r>
+        <w:rPr>
+          <w:spacing w:val="-2"/>
+        </w:rPr>
+        <w:t>LITIES}</w:t>
+      </w:r>
+    </w:p>
+    <w:p>
+      <w:pPr>
+        <w:pStyle w:val="BodyText"/>
         <w:ind w:left="340"/>
-        <w:rPr>
-          <w:i/>
-          <w:sz w:val="24"/>
-        </w:rPr>
-      </w:pPr>
-      <w:r>
-        <w:rPr>
-          <w:sz w:val="24"/>
-        </w:rPr>
-        <w:t>(</w:t>
-      </w:r>
-      <w:r>
-        <w:rPr>
-          <w:i/>
-          <w:sz w:val="24"/>
-        </w:rPr>
-        <w:t>Please</w:t>
-      </w:r>
-      <w:r>
-        <w:rPr>
-          <w:i/>
-          <w:spacing w:val="-2"/>
-          <w:sz w:val="24"/>
-        </w:rPr>
-        <w:t xml:space="preserve"> </w:t>
-      </w:r>
-      <w:r>
-        <w:rPr>
-          <w:i/>
-          <w:sz w:val="24"/>
-        </w:rPr>
-        <w:t>provide</w:t>
-      </w:r>
-      <w:r>
-        <w:rPr>
-          <w:i/>
-          <w:spacing w:val="-2"/>
-          <w:sz w:val="24"/>
-        </w:rPr>
-        <w:t xml:space="preserve"> </w:t>
-      </w:r>
-      <w:r>
-        <w:rPr>
-          <w:i/>
-          <w:sz w:val="24"/>
-        </w:rPr>
-        <w:t>the</w:t>
-      </w:r>
-      <w:r>
-        <w:rPr>
-          <w:i/>
-          <w:spacing w:val="-2"/>
-          <w:sz w:val="24"/>
-        </w:rPr>
-        <w:t xml:space="preserve"> </w:t>
-      </w:r>
-      <w:r>
-        <w:rPr>
-          <w:i/>
-          <w:sz w:val="24"/>
-        </w:rPr>
-        <w:t>list</w:t>
-      </w:r>
-      <w:r>
-        <w:rPr>
-          <w:i/>
-          <w:spacing w:val="-1"/>
-          <w:sz w:val="24"/>
-        </w:rPr>
-        <w:t xml:space="preserve"> </w:t>
-      </w:r>
-      <w:r>
-        <w:rPr>
-          <w:i/>
-          <w:sz w:val="24"/>
-        </w:rPr>
-        <w:t>of</w:t>
-      </w:r>
-      <w:r>
-        <w:rPr>
-          <w:i/>
-          <w:spacing w:val="-1"/>
-          <w:sz w:val="24"/>
-        </w:rPr>
-        <w:t xml:space="preserve"> </w:t>
-      </w:r>
-      <w:r>
-        <w:rPr>
-          <w:i/>
-          <w:sz w:val="24"/>
-        </w:rPr>
-        <w:t>interventions</w:t>
-      </w:r>
-      <w:r>
-        <w:rPr>
-          <w:i/>
-          <w:spacing w:val="-1"/>
-          <w:sz w:val="24"/>
-        </w:rPr>
-        <w:t xml:space="preserve"> </w:t>
-      </w:r>
-      <w:r>
-        <w:rPr>
-          <w:i/>
-          <w:spacing w:val="-4"/>
-          <w:sz w:val="24"/>
-        </w:rPr>
-        <w:t>here)</w:t>
-      </w:r>
-    </w:p>
-    <w:p>
-      <w:pPr>
-        <w:pStyle w:val="BodyText"/>
-        <w:rPr>
-          <w:i/>
-        </w:rPr>
-      </w:pPr>
-    </w:p>
-    <w:p>
-      <w:pPr>
-        <w:pStyle w:val="BodyText"/>
-        <w:ind w:left="340"/>
-      </w:pPr>
-      <w:r>
-        <w:rPr>
-          <w:spacing w:val="-2"/>
-        </w:rPr>
-        <w:t>To..........................................................................</w:t>
-      </w:r>
-    </w:p>
-    <w:p>
-      <w:pPr>
-        <w:pStyle w:val="BodyText"/>
-      </w:pPr>
-    </w:p>
-    <w:p>
-      <w:pPr>
-        <w:pStyle w:val="BodyText"/>
-        <w:ind w:left="340"/>
-      </w:pPr>
-      <w:r>
-        <w:rPr>
-          <w:spacing w:val="-2"/>
-        </w:rPr>
-        <w:t>To.............................................................................</w:t>
-      </w:r>
-    </w:p>
-    <w:p>
-      <w:pPr>
-        <w:pStyle w:val="BodyText"/>
-        <w:ind w:left="340"/>
-      </w:pPr>
-      <w:r>
-        <w:rPr>
-          <w:spacing w:val="-2"/>
-        </w:rPr>
-        <w:t>To............................................................................</w:t>
-      </w:r>
+      </w:pPr>
     </w:p>
     <w:p>
       <w:pPr>
@@ -4080,34 +3503,13 @@
           <w:color w:val="000000"/>
           <w:shd w:val="clear" w:color="auto" w:fill="FFFF00"/>
         </w:rPr>
-        <w:t>[Proposed instituti</w:t>
-      </w:r>
-      <w:r>
-        <w:rPr>
-          <w:color w:val="000000"/>
-          <w:shd w:val="clear" w:color="auto" w:fill="FFFF00"/>
-        </w:rPr>
-        <w:t>on</w:t>
-      </w:r>
-      <w:r>
-        <w:rPr>
-          <w:color w:val="000000"/>
-        </w:rPr>
-        <w:t>] agrees to submit regular financial and activity reports on progress made, challenges and future projections to the Ministry of Health’s Partners/</w:t>
-      </w:r>
-      <w:proofErr w:type="spellStart"/>
-      <w:r>
-        <w:rPr>
-          <w:color w:val="000000"/>
-        </w:rPr>
-        <w:t>SWAp</w:t>
-      </w:r>
-      <w:proofErr w:type="spellEnd"/>
-      <w:r>
-        <w:rPr>
-          <w:color w:val="000000"/>
-        </w:rPr>
-        <w:t xml:space="preserve"> Coordination and affiliated institutions informed about its projects, as well as reporting in </w:t>
+        <w:t xml:space="preserve">{ORGANIZATION_NAME} </w:t>
+      </w:r>
+      <w:r>
+        <w:rPr>
+          <w:color w:val="000000"/>
+        </w:rPr>
+        <w:t xml:space="preserve">agrees to submit regular financial and activity reports on progress made, challenges and future projections to the Ministry of Health’s Partners/SWAp Coordination and affiliated institutions informed about its projects, as well as reporting in </w:t>
       </w:r>
       <w:r>
         <w:rPr>
@@ -4140,14 +3542,7 @@
           <w:smallCaps/>
           <w:spacing w:val="-2"/>
         </w:rPr>
-        <w:t>I</w:t>
-      </w:r>
-      <w:r>
-        <w:rPr>
-          <w:smallCaps/>
-          <w:spacing w:val="-2"/>
-        </w:rPr>
-        <w:t>ntellectual</w:t>
+        <w:t>Intellectual</w:t>
       </w:r>
       <w:r>
         <w:rPr>
@@ -4220,19 +3615,13 @@
           <w:color w:val="000000"/>
           <w:shd w:val="clear" w:color="auto" w:fill="FFFF00"/>
         </w:rPr>
-        <w:t>[Proposed institution]</w:t>
-      </w:r>
-      <w:r>
-        <w:rPr>
-          <w:color w:val="000000"/>
-        </w:rPr>
-        <w:t xml:space="preserve"> may do so only with the prior consultations with the MOH and within the li</w:t>
-      </w:r>
-      <w:r>
-        <w:rPr>
-          <w:color w:val="000000"/>
-        </w:rPr>
-        <w:t>mits of the Rwanda law on Data Protection and Privacy. Both Parties agree to properly attribute authorship or contributions of the other in any publications that include any such</w:t>
+        <w:t>{ORGANIZATION_NAME}</w:t>
+      </w:r>
+      <w:r>
+        <w:rPr>
+          <w:color w:val="000000"/>
+        </w:rPr>
+        <w:t xml:space="preserve"> may do so only with the prior consultations with the MOH and within the limits of the Rwanda law on Data Protection and Privacy. Both Parties agree to properly attribute authorship or contributions of the other in any publications that include any such</w:t>
       </w:r>
       <w:r>
         <w:rPr>
@@ -4304,10 +3693,7 @@
         <w:jc w:val="both"/>
       </w:pPr>
       <w:r>
-        <w:t>The laws of Rwanda shall govern this MoU. A</w:t>
-      </w:r>
-      <w:r>
-        <w:t>ny dispute, misinterpretation or misunderstanding arising out of the implementation of any provisions of this Memorandum</w:t>
+        <w:t>The laws of Rwanda shall govern this MoU. Any dispute, misinterpretation or misunderstanding arising out of the implementation of any provisions of this Memorandum</w:t>
       </w:r>
       <w:r>
         <w:rPr>
@@ -4316,10 +3702,7 @@
         <w:t xml:space="preserve"> </w:t>
       </w:r>
       <w:r>
-        <w:t>of Understanding shall be settled amicably. In case the parties fail to agree either party shall have the liberty to terminate this MoU</w:t>
-      </w:r>
-      <w:r>
-        <w:t>.</w:t>
+        <w:t>of Understanding shall be settled amicably. In case the parties fail to agree either party shall have the liberty to terminate this MoU.</w:t>
       </w:r>
     </w:p>
     <w:p>
@@ -4443,10 +3826,7 @@
         <w:jc w:val="both"/>
       </w:pPr>
       <w:r>
-        <w:t xml:space="preserve">This MoU does not constitute or replace the registration certificate for NGOs issued by </w:t>
-      </w:r>
-      <w:r>
-        <w:t>the RGB, therefore</w:t>
+        <w:t>This MoU does not constitute or replace the registration certificate for NGOs issued by the RGB, therefore</w:t>
       </w:r>
       <w:r>
         <w:rPr>
@@ -4576,29 +3956,7 @@
           <w:color w:val="000000"/>
           <w:shd w:val="clear" w:color="auto" w:fill="FFFF00"/>
         </w:rPr>
-        <w:t>[Proposed</w:t>
-      </w:r>
-      <w:r>
-        <w:rPr>
-          <w:color w:val="000000"/>
-          <w:spacing w:val="-2"/>
-          <w:shd w:val="clear" w:color="auto" w:fill="FFFF00"/>
-        </w:rPr>
-        <w:t xml:space="preserve"> </w:t>
-      </w:r>
-      <w:r>
-        <w:rPr>
-          <w:color w:val="000000"/>
-          <w:shd w:val="clear" w:color="auto" w:fill="FFFF00"/>
-        </w:rPr>
-        <w:t>institution]</w:t>
-      </w:r>
-      <w:r>
-        <w:rPr>
-          <w:color w:val="000000"/>
-          <w:spacing w:val="-3"/>
-        </w:rPr>
-        <w:t xml:space="preserve"> </w:t>
+        <w:t xml:space="preserve">{ORGANIZATION_NAME} </w:t>
       </w:r>
       <w:r>
         <w:rPr>
@@ -4808,10 +4166,7 @@
         <w:t xml:space="preserve"> </w:t>
       </w:r>
       <w:r>
-        <w:t>Ag</w:t>
-      </w:r>
-      <w:r>
-        <w:t>reement</w:t>
+        <w:t>Agreement</w:t>
       </w:r>
       <w:r>
         <w:rPr>
@@ -4983,7 +4338,7 @@
       <w:tblGrid>
         <w:gridCol w:w="3597"/>
         <w:gridCol w:w="1979"/>
-        <w:gridCol w:w="2883"/>
+        <w:gridCol w:w="3757"/>
       </w:tblGrid>
       <w:tr>
         <w:trPr>
@@ -5060,7 +4415,7 @@
         </w:tc>
         <w:tc>
           <w:tcPr>
-            <w:tcW w:w="4862" w:type="dxa"/>
+            <w:tcW w:w="5736" w:type="dxa"/>
             <w:gridSpan w:val="2"/>
           </w:tcPr>
           <w:p>
@@ -5195,16 +4550,16 @@
         </w:tc>
         <w:tc>
           <w:tcPr>
-            <w:tcW w:w="2883" w:type="dxa"/>
+            <w:tcW w:w="3757" w:type="dxa"/>
           </w:tcPr>
           <w:p>
             <w:pPr>
-              <w:pStyle w:val="TableParagraph"/>
-              <w:spacing w:line="271" w:lineRule="exact"/>
-              <w:ind w:right="47"/>
+              <w:spacing w:before="90"/>
+              <w:ind w:left="340"/>
               <w:jc w:val="right"/>
               <w:rPr>
                 <w:b/>
+                <w:i/>
                 <w:sz w:val="24"/>
               </w:rPr>
             </w:pPr>
@@ -5243,25 +4598,14 @@
                 <w:b/>
                 <w:sz w:val="24"/>
               </w:rPr>
-              <w:t>of</w:t>
+              <w:t>o</w:t>
             </w:r>
             <w:r>
               <w:rPr>
                 <w:b/>
-                <w:spacing w:val="-1"/>
                 <w:sz w:val="24"/>
               </w:rPr>
-              <w:t xml:space="preserve"> </w:t>
-            </w:r>
-            <w:r>
-              <w:rPr>
-                <w:b/>
-                <w:color w:val="000000"/>
-                <w:spacing w:val="-4"/>
-                <w:sz w:val="24"/>
-                <w:shd w:val="clear" w:color="auto" w:fill="00FFFF"/>
-              </w:rPr>
-              <w:t>…………</w:t>
+              <w:t>f  {ORGANIZATION_NAME}</w:t>
             </w:r>
           </w:p>
           <w:p>
@@ -5416,7 +4760,7 @@
           <w:sz w:val="24"/>
           <w:shd w:val="clear" w:color="auto" w:fill="00FFFF"/>
         </w:rPr>
-        <w:t>Names……………</w:t>
+        <w:t>{PARTY_SIGNATORY_NAME}</w:t>
       </w:r>
     </w:p>
     <w:p>
@@ -5475,7 +4819,7 @@
           <w:sz w:val="24"/>
           <w:shd w:val="clear" w:color="auto" w:fill="00FFFF"/>
         </w:rPr>
-        <w:t>Position………….</w:t>
+        <w:t>{PARTY_SIGNATORY_POSITION}</w:t>
       </w:r>
     </w:p>
     <w:sectPr>
@@ -5663,7 +5007,6 @@
       <w:lvlJc w:val="left"/>
       <w:pPr>
         <w:ind w:left="1060" w:hanging="360"/>
-        <w:jc w:val="left"/>
       </w:pPr>
       <w:rPr>
         <w:rFonts w:ascii="Times New Roman" w:eastAsia="Times New Roman" w:hAnsi="Times New Roman" w:cs="Times New Roman" w:hint="default"/>
@@ -5786,7 +5129,6 @@
       <w:lvlJc w:val="left"/>
       <w:pPr>
         <w:ind w:left="1060" w:hanging="720"/>
-        <w:jc w:val="left"/>
       </w:pPr>
       <w:rPr>
         <w:rFonts w:ascii="Georgia" w:eastAsia="Georgia" w:hAnsi="Georgia" w:cs="Georgia" w:hint="default"/>
@@ -5808,7 +5150,6 @@
       <w:lvlJc w:val="left"/>
       <w:pPr>
         <w:ind w:left="1060" w:hanging="360"/>
-        <w:jc w:val="left"/>
       </w:pPr>
       <w:rPr>
         <w:rFonts w:ascii="Times New Roman" w:eastAsia="Times New Roman" w:hAnsi="Times New Roman" w:cs="Times New Roman" w:hint="default"/>
@@ -5919,7 +5260,6 @@
       <w:lvlJc w:val="left"/>
       <w:pPr>
         <w:ind w:left="340" w:hanging="432"/>
-        <w:jc w:val="left"/>
       </w:pPr>
       <w:rPr>
         <w:rFonts w:ascii="Times New Roman" w:eastAsia="Times New Roman" w:hAnsi="Times New Roman" w:cs="Times New Roman" w:hint="default"/>
@@ -5941,7 +5281,6 @@
       <w:lvlJc w:val="left"/>
       <w:pPr>
         <w:ind w:left="700" w:hanging="360"/>
-        <w:jc w:val="left"/>
       </w:pPr>
       <w:rPr>
         <w:rFonts w:hint="default"/>

</xml_diff>

<commit_message>
fix: change the mou templates to the latest ones
</commit_message>
<xml_diff>
--- a/mou_templates/mou_international.docx
+++ b/mou_templates/mou_international.docx
@@ -228,7 +228,14 @@
           <w:b/>
           <w:caps/>
         </w:rPr>
-        <w:t>{ORgANIZATION_NAME}</w:t>
+        <w:t>{ORGANIZATION_NAME</w:t>
+      </w:r>
+      <w:r>
+        <w:rPr>
+          <w:b/>
+          <w:caps/>
+        </w:rPr>
+        <w:t>}</w:t>
       </w:r>
     </w:p>
     <w:p>
@@ -760,7 +767,7 @@
           <w:highlight w:val="yellow"/>
           <w:lang w:val="en-GB"/>
         </w:rPr>
-        <w:t>{ORGANIZATION_NAME}</w:t>
+        <w:t>{ORGANOZATION_NAME}</w:t>
       </w:r>
     </w:p>
     <w:p>
@@ -867,7 +874,6 @@
           <w:lang w:val="en-GB"/>
         </w:rPr>
       </w:pPr>
-      <w:proofErr w:type="gramStart"/>
       <w:r>
         <w:rPr>
           <w:lang w:val="en-GB"/>
@@ -878,14 +884,7 @@
         <w:rPr>
           <w:lang w:val="en-GB"/>
         </w:rPr>
-        <w:t>{</w:t>
-      </w:r>
-      <w:proofErr w:type="gramEnd"/>
-      <w:r>
-        <w:rPr>
-          <w:lang w:val="en-GB"/>
-        </w:rPr>
-        <w:t>ORGANIZATION_WEBSITE}</w:t>
+        <w:t xml:space="preserve"> {ORGANIZATION_WEBSITE}</w:t>
       </w:r>
     </w:p>
     <w:p>
@@ -921,35 +920,49 @@
         <w:rPr>
           <w:lang w:val="en-GB"/>
         </w:rPr>
-        <w:t>……………………..</w:t>
-      </w:r>
-    </w:p>
-    <w:p>
-      <w:pPr>
-        <w:jc w:val="both"/>
-        <w:rPr>
-          <w:lang w:val="en-GB"/>
-        </w:rPr>
-      </w:pPr>
-      <w:r>
-        <w:rPr>
-          <w:lang w:val="en-GB"/>
-        </w:rPr>
-        <w:t>…………………..</w:t>
-      </w:r>
-    </w:p>
-    <w:p>
-      <w:pPr>
-        <w:jc w:val="both"/>
-        <w:rPr>
-          <w:lang w:val="en-GB"/>
-        </w:rPr>
-      </w:pPr>
-      <w:r>
-        <w:rPr>
-          <w:lang w:val="en-GB"/>
-        </w:rPr>
-        <w:t>…………………….</w:t>
+        <w:t>{HOME_COUNTRY}</w:t>
+      </w:r>
+    </w:p>
+    <w:p>
+      <w:pPr>
+        <w:jc w:val="both"/>
+        <w:rPr>
+          <w:lang w:val="en-GB"/>
+        </w:rPr>
+      </w:pPr>
+      <w:r>
+        <w:rPr>
+          <w:lang w:val="en-GB"/>
+        </w:rPr>
+        <w:t>{HOME_COUNTRY_PROVINCE}, {HOME_COUNTRY_DISTRICT}</w:t>
+      </w:r>
+    </w:p>
+    <w:p>
+      <w:pPr>
+        <w:jc w:val="both"/>
+        <w:rPr>
+          <w:lang w:val="en-GB"/>
+        </w:rPr>
+      </w:pPr>
+      <w:r>
+        <w:rPr>
+          <w:lang w:val="en-GB"/>
+        </w:rPr>
+        <w:t>{HOME_COUNTRY_AVENUE}</w:t>
+      </w:r>
+    </w:p>
+    <w:p>
+      <w:pPr>
+        <w:jc w:val="both"/>
+        <w:rPr>
+          <w:lang w:val="en-GB"/>
+        </w:rPr>
+      </w:pPr>
+      <w:r>
+        <w:rPr>
+          <w:lang w:val="en-GB"/>
+        </w:rPr>
+        <w:t>{HOME_COUNTRY_PO_BOX}</w:t>
       </w:r>
     </w:p>
     <w:p>
@@ -1197,7 +1210,7 @@
         <w:rPr>
           <w:lang w:val="en-GB"/>
         </w:rPr>
-        <w:t xml:space="preserve"> both parties agree </w:t>
+        <w:t xml:space="preserve">; both parties agree </w:t>
       </w:r>
       <w:r>
         <w:rPr>
@@ -1212,7 +1225,7 @@
         <w:t xml:space="preserve">partnership/collaboration in </w:t>
       </w:r>
       <w:r>
-        <w:t>{PROJECT_NAME}</w:t>
+        <w:t>{PROJECT_NAME}.</w:t>
       </w:r>
     </w:p>
     <w:p>
@@ -1359,28 +1372,24 @@
       <w:r>
         <w:rPr>
           <w:bCs/>
-          <w:highlight w:val="cyan"/>
         </w:rPr>
         <w:t>one (1</w:t>
       </w:r>
       <w:r>
         <w:rPr>
           <w:bCs/>
-          <w:highlight w:val="cyan"/>
         </w:rPr>
         <w:t xml:space="preserve">) </w:t>
       </w:r>
       <w:r>
         <w:rPr>
           <w:bCs/>
-          <w:highlight w:val="cyan"/>
         </w:rPr>
         <w:t>y</w:t>
       </w:r>
       <w:r>
         <w:rPr>
           <w:bCs/>
-          <w:highlight w:val="cyan"/>
         </w:rPr>
         <w:t>ear</w:t>
       </w:r>
@@ -1497,42 +1506,40 @@
     <w:p>
       <w:pPr>
         <w:jc w:val="both"/>
+      </w:pPr>
+      <w:r>
+        <w:t>The overall goal for this project is</w:t>
+      </w:r>
+      <w:r>
+        <w:rPr>
+          <w:lang w:val="en-GB"/>
+        </w:rPr>
+        <w:t xml:space="preserve"> {OVERALL_GOAL} </w:t>
+      </w:r>
+      <w:r>
+        <w:t>and specific objectives are:</w:t>
+      </w:r>
+      <w:r>
+        <w:t xml:space="preserve"> </w:t>
+      </w:r>
+    </w:p>
+    <w:p>
+      <w:pPr>
+        <w:jc w:val="both"/>
         <w:rPr>
           <w:highlight w:val="green"/>
         </w:rPr>
       </w:pPr>
-      <w:r>
-        <w:rPr>
-          <w:highlight w:val="green"/>
-        </w:rPr>
-        <w:t xml:space="preserve">The overall goal for this project is </w:t>
-      </w:r>
-      <w:r>
-        <w:rPr>
-          <w:highlight w:val="green"/>
-        </w:rPr>
-        <w:t xml:space="preserve">{OVERALL_GOAL} </w:t>
-      </w:r>
-      <w:r>
-        <w:rPr>
-          <w:highlight w:val="green"/>
-        </w:rPr>
-        <w:t>and specific objectives are:</w:t>
-      </w:r>
-      <w:r>
-        <w:rPr>
-          <w:highlight w:val="green"/>
-        </w:rPr>
-        <w:t xml:space="preserve"> </w:t>
-      </w:r>
-    </w:p>
-    <w:p>
-      <w:pPr>
-        <w:jc w:val="both"/>
-        <w:rPr>
-          <w:highlight w:val="green"/>
-        </w:rPr>
-      </w:pPr>
+    </w:p>
+    <w:p>
+      <w:pPr>
+        <w:ind w:firstLine="432"/>
+        <w:jc w:val="both"/>
+      </w:pPr>
+      <w:r>
+        <w:tab/>
+        <w:t>{PROJECT_GOALS}</w:t>
+      </w:r>
     </w:p>
     <w:p>
       <w:pPr>
@@ -1542,10 +1549,6 @@
         </w:tabs>
         <w:jc w:val="both"/>
       </w:pPr>
-      <w:r>
-        <w:tab/>
-        <w:t>{PROJECT_GOALS}</w:t>
-      </w:r>
     </w:p>
     <w:p>
       <w:pPr>
@@ -1699,25 +1702,22 @@
         <w:t>inform</w:t>
       </w:r>
       <w:r>
+        <w:t xml:space="preserve"> {ORGANIZATION_NAME}</w:t>
+      </w:r>
+      <w:r>
         <w:t xml:space="preserve"> </w:t>
       </w:r>
       <w:r>
-        <w:t>{ORGANIZATION_NAME}</w:t>
+        <w:t>of any concerns or changes in the National Health Policy</w:t>
       </w:r>
       <w:r>
         <w:t xml:space="preserve"> </w:t>
       </w:r>
       <w:r>
-        <w:t>of any concerns or changes in the National Health Policy</w:t>
-      </w:r>
-      <w:r>
-        <w:t xml:space="preserve"> </w:t>
-      </w:r>
-      <w:r>
-        <w:t xml:space="preserve">where </w:t>
-      </w:r>
-      <w:r>
-        <w:t>{ACTIVITY_DOMAINS}</w:t>
+        <w:t>where</w:t>
+      </w:r>
+      <w:r>
+        <w:t xml:space="preserve"> {ACTIVITY_DOMAINS}</w:t>
       </w:r>
       <w:r>
         <w:t xml:space="preserve"> </w:t>
@@ -2009,24 +2009,52 @@
     </w:p>
     <w:p>
       <w:pPr>
-        <w:jc w:val="both"/>
-      </w:pPr>
-    </w:p>
-    <w:p>
-      <w:pPr>
-        <w:jc w:val="both"/>
-      </w:pPr>
-      <w:r>
-        <w:t>{PARTY_RESPONSIBILITIES}</w:t>
-      </w:r>
-    </w:p>
-    <w:p>
-      <w:pPr>
-        <w:jc w:val="both"/>
-      </w:pPr>
-    </w:p>
-    <w:p>
-      <w:pPr>
+        <w:rPr>
+          <w:i/>
+        </w:rPr>
+      </w:pPr>
+    </w:p>
+    <w:p>
+      <w:pPr>
+        <w:rPr>
+          <w:iCs/>
+        </w:rPr>
+      </w:pPr>
+      <w:r>
+        <w:rPr>
+          <w:iCs/>
+        </w:rPr>
+        <w:t>{</w:t>
+      </w:r>
+      <w:r>
+        <w:rPr>
+          <w:iCs/>
+        </w:rPr>
+        <w:t>PARTY_RESPONSIBILITIES</w:t>
+      </w:r>
+      <w:r>
+        <w:rPr>
+          <w:iCs/>
+        </w:rPr>
+        <w:t>}</w:t>
+      </w:r>
+    </w:p>
+    <w:p>
+      <w:pPr>
+        <w:jc w:val="both"/>
+      </w:pPr>
+    </w:p>
+    <w:p>
+      <w:pPr>
+        <w:numPr>
+          <w:ilvl w:val="0"/>
+          <w:numId w:val="1"/>
+        </w:numPr>
+        <w:tabs>
+          <w:tab w:val="clear" w:pos="360"/>
+          <w:tab w:val="num" w:pos="720"/>
+        </w:tabs>
+        <w:ind w:left="720"/>
         <w:jc w:val="both"/>
         <w:rPr>
           <w:b/>
@@ -2530,15 +2558,7 @@
           <w:b w:val="0"/>
           <w:szCs w:val="24"/>
         </w:rPr>
-        <w:t>(Date/Month/Year)</w:t>
-      </w:r>
-      <w:r>
-        <w:rPr>
-          <w:rFonts w:ascii="Times New Roman" w:hAnsi="Times New Roman"/>
-          <w:b w:val="0"/>
-          <w:szCs w:val="24"/>
-        </w:rPr>
-        <w:t>.</w:t>
+        <w:t>{DATE}.</w:t>
       </w:r>
     </w:p>
     <w:p>
@@ -3136,7 +3156,7 @@
         <w:rPr>
           <w:b/>
         </w:rPr>
-        <w:t>{PARTY_SIGNATORY_POSTION}</w:t>
+        <w:t>{PARTY_SIGNATORY_POSITION}</w:t>
       </w:r>
     </w:p>
     <w:sectPr>

</xml_diff>

<commit_message>
fix: format the templates correctly
</commit_message>
<xml_diff>
--- a/mou_templates/mou_international.docx
+++ b/mou_templates/mou_international.docx
@@ -1,6 +1,6 @@
 
 <file path=word/document.xml><?xml version="1.0" encoding="utf-8"?>
-<w:document xmlns:wpc="http://schemas.microsoft.com/office/word/2010/wordprocessingCanvas" xmlns:cx="http://schemas.microsoft.com/office/drawing/2014/chartex" xmlns:cx1="http://schemas.microsoft.com/office/drawing/2015/9/8/chartex" xmlns:cx2="http://schemas.microsoft.com/office/drawing/2015/10/21/chartex" xmlns:cx3="http://schemas.microsoft.com/office/drawing/2016/5/9/chartex" xmlns:cx4="http://schemas.microsoft.com/office/drawing/2016/5/10/chartex" xmlns:cx5="http://schemas.microsoft.com/office/drawing/2016/5/11/chartex" xmlns:cx6="http://schemas.microsoft.com/office/drawing/2016/5/12/chartex" xmlns:cx7="http://schemas.microsoft.com/office/drawing/2016/5/13/chartex" xmlns:cx8="http://schemas.microsoft.com/office/drawing/2016/5/14/chartex" xmlns:mc="http://schemas.openxmlformats.org/markup-compatibility/2006" xmlns:aink="http://schemas.microsoft.com/office/drawing/2016/ink" xmlns:am3d="http://schemas.microsoft.com/office/drawing/2017/model3d" xmlns:o="urn:schemas-microsoft-com:office:office" xmlns:r="http://schemas.openxmlformats.org/officeDocument/2006/relationships" xmlns:m="http://schemas.openxmlformats.org/officeDocument/2006/math" xmlns:v="urn:schemas-microsoft-com:vml" xmlns:wp14="http://schemas.microsoft.com/office/word/2010/wordprocessingDrawing" xmlns:wp="http://schemas.openxmlformats.org/drawingml/2006/wordprocessingDrawing" xmlns:w10="urn:schemas-microsoft-com:office:word" xmlns:w="http://schemas.openxmlformats.org/wordprocessingml/2006/main" xmlns:w14="http://schemas.microsoft.com/office/word/2010/wordml" xmlns:w15="http://schemas.microsoft.com/office/word/2012/wordml" xmlns:w16cex="http://schemas.microsoft.com/office/word/2018/wordml/cex" xmlns:w16cid="http://schemas.microsoft.com/office/word/2016/wordml/cid" xmlns:w16="http://schemas.microsoft.com/office/word/2018/wordml" xmlns:w16sdtdh="http://schemas.microsoft.com/office/word/2020/wordml/sdtdatahash" xmlns:w16se="http://schemas.microsoft.com/office/word/2015/wordml/symex" xmlns:wpg="http://schemas.microsoft.com/office/word/2010/wordprocessingGroup" xmlns:wpi="http://schemas.microsoft.com/office/word/2010/wordprocessingInk" xmlns:wne="http://schemas.microsoft.com/office/word/2006/wordml" xmlns:wps="http://schemas.microsoft.com/office/word/2010/wordprocessingShape" mc:Ignorable="w14 w15 w16se w16cid w16 w16cex w16sdtdh wp14">
+<w:document xmlns:wpc="http://schemas.microsoft.com/office/word/2010/wordprocessingCanvas" xmlns:cx="http://schemas.microsoft.com/office/drawing/2014/chartex" xmlns:cx1="http://schemas.microsoft.com/office/drawing/2015/9/8/chartex" xmlns:cx2="http://schemas.microsoft.com/office/drawing/2015/10/21/chartex" xmlns:cx3="http://schemas.microsoft.com/office/drawing/2016/5/9/chartex" xmlns:cx4="http://schemas.microsoft.com/office/drawing/2016/5/10/chartex" xmlns:cx5="http://schemas.microsoft.com/office/drawing/2016/5/11/chartex" xmlns:cx6="http://schemas.microsoft.com/office/drawing/2016/5/12/chartex" xmlns:cx7="http://schemas.microsoft.com/office/drawing/2016/5/13/chartex" xmlns:cx8="http://schemas.microsoft.com/office/drawing/2016/5/14/chartex" xmlns:mc="http://schemas.openxmlformats.org/markup-compatibility/2006" xmlns:aink="http://schemas.microsoft.com/office/drawing/2016/ink" xmlns:am3d="http://schemas.microsoft.com/office/drawing/2017/model3d" xmlns:o="urn:schemas-microsoft-com:office:office" xmlns:oel="http://schemas.microsoft.com/office/2019/extlst" xmlns:r="http://schemas.openxmlformats.org/officeDocument/2006/relationships" xmlns:m="http://schemas.openxmlformats.org/officeDocument/2006/math" xmlns:v="urn:schemas-microsoft-com:vml" xmlns:wp14="http://schemas.microsoft.com/office/word/2010/wordprocessingDrawing" xmlns:wp="http://schemas.openxmlformats.org/drawingml/2006/wordprocessingDrawing" xmlns:w10="urn:schemas-microsoft-com:office:word" xmlns:w="http://schemas.openxmlformats.org/wordprocessingml/2006/main" xmlns:w14="http://schemas.microsoft.com/office/word/2010/wordml" xmlns:w15="http://schemas.microsoft.com/office/word/2012/wordml" xmlns:w16cex="http://schemas.microsoft.com/office/word/2018/wordml/cex" xmlns:w16cid="http://schemas.microsoft.com/office/word/2016/wordml/cid" xmlns:w16="http://schemas.microsoft.com/office/word/2018/wordml" xmlns:w16du="http://schemas.microsoft.com/office/word/2023/wordml/word16du" xmlns:w16sdtdh="http://schemas.microsoft.com/office/word/2020/wordml/sdtdatahash" xmlns:w16se="http://schemas.microsoft.com/office/word/2015/wordml/symex" xmlns:wpg="http://schemas.microsoft.com/office/word/2010/wordprocessingGroup" xmlns:wpi="http://schemas.microsoft.com/office/word/2010/wordprocessingInk" xmlns:wne="http://schemas.microsoft.com/office/word/2006/wordml" xmlns:wps="http://schemas.microsoft.com/office/word/2010/wordprocessingShape" mc:Ignorable="w14 w15 w16se w16cid w16 w16cex w16sdtdh w16du wp14">
   <w:body>
     <w:p>
       <w:pPr>
@@ -964,14 +964,6 @@
         </w:rPr>
         <w:t>{HOME_COUNTRY_PO_BOX}</w:t>
       </w:r>
-    </w:p>
-    <w:p>
-      <w:pPr>
-        <w:jc w:val="both"/>
-        <w:rPr>
-          <w:lang w:val="en-GB"/>
-        </w:rPr>
-      </w:pPr>
     </w:p>
     <w:p>
       <w:pPr>
@@ -1136,15 +1128,6 @@
     <w:p>
       <w:pPr>
         <w:jc w:val="both"/>
-        <w:rPr>
-          <w:b/>
-          <w:lang w:val="en-GB"/>
-        </w:rPr>
-      </w:pPr>
-    </w:p>
-    <w:p>
-      <w:pPr>
-        <w:jc w:val="both"/>
       </w:pPr>
     </w:p>
     <w:p>
@@ -1239,7 +1222,7 @@
     </w:p>
     <w:p>
       <w:pPr>
-        <w:pStyle w:val="MediumGrid1-Accent2"/>
+        <w:pStyle w:val="MediumGrid1-Accent21"/>
         <w:numPr>
           <w:ilvl w:val="0"/>
           <w:numId w:val="5"/>
@@ -1453,18 +1436,6 @@
         <w:autoSpaceDE w:val="0"/>
         <w:autoSpaceDN w:val="0"/>
         <w:adjustRightInd w:val="0"/>
-        <w:ind w:left="720"/>
-        <w:jc w:val="both"/>
-        <w:rPr>
-          <w:bCs/>
-        </w:rPr>
-      </w:pPr>
-    </w:p>
-    <w:p>
-      <w:pPr>
-        <w:autoSpaceDE w:val="0"/>
-        <w:autoSpaceDN w:val="0"/>
-        <w:adjustRightInd w:val="0"/>
         <w:jc w:val="both"/>
         <w:rPr>
           <w:bCs/>
@@ -1548,28 +1519,10 @@
           <w:tab w:val="left" w:leader="dot" w:pos="9720"/>
         </w:tabs>
         <w:jc w:val="both"/>
-      </w:pPr>
-    </w:p>
-    <w:p>
-      <w:pPr>
-        <w:tabs>
-          <w:tab w:val="left" w:pos="720"/>
-          <w:tab w:val="left" w:leader="dot" w:pos="9720"/>
-        </w:tabs>
-        <w:jc w:val="both"/>
-        <w:rPr>
-          <w:lang w:val="en-GB"/>
-        </w:rPr>
-      </w:pPr>
-      <w:r>
-        <w:rPr>
-          <w:lang w:val="en-GB"/>
-        </w:rPr>
-        <w:t xml:space="preserve"> </w:t>
-      </w:r>
-      <w:r>
-        <w:t xml:space="preserve">  </w:t>
-      </w:r>
+        <w:rPr>
+          <w:lang w:val="en-GB"/>
+        </w:rPr>
+      </w:pPr>
     </w:p>
     <w:p>
       <w:pPr>
@@ -1680,12 +1633,6 @@
     </w:p>
     <w:p>
       <w:pPr>
-        <w:ind w:left="648"/>
-        <w:jc w:val="both"/>
-      </w:pPr>
-    </w:p>
-    <w:p>
-      <w:pPr>
         <w:numPr>
           <w:ilvl w:val="0"/>
           <w:numId w:val="8"/>
@@ -1886,17 +1833,7 @@
         <w:t>In accordance with Rwandan laws, the Administration will facilitate the request for taxes exemption of applicable items to be used under this agreement.</w:t>
       </w:r>
     </w:p>
-    <w:p>
-      <w:pPr>
-        <w:ind w:left="288"/>
-        <w:jc w:val="both"/>
-      </w:pPr>
-    </w:p>
-    <w:p>
-      <w:pPr>
-        <w:jc w:val="both"/>
-      </w:pPr>
-    </w:p>
+    <w:p/>
     <w:p>
       <w:pPr>
         <w:ind w:left="648"/>
@@ -2129,13 +2066,13 @@
     </w:p>
     <w:p>
       <w:pPr>
-        <w:pStyle w:val="MediumGrid1-Accent2"/>
-        <w:jc w:val="both"/>
-      </w:pPr>
-    </w:p>
-    <w:p>
-      <w:pPr>
-        <w:pStyle w:val="MediumGrid1-Accent2"/>
+        <w:pStyle w:val="MediumGrid1-Accent21"/>
+        <w:jc w:val="both"/>
+      </w:pPr>
+    </w:p>
+    <w:p>
+      <w:pPr>
+        <w:pStyle w:val="MediumGrid1-Accent21"/>
         <w:numPr>
           <w:ilvl w:val="0"/>
           <w:numId w:val="5"/>
@@ -2152,35 +2089,38 @@
           <w:b/>
           <w:smallCaps/>
         </w:rPr>
+        <w:t>Intellectual Property Ownership</w:t>
+      </w:r>
+    </w:p>
+    <w:p>
+      <w:pPr>
+        <w:pStyle w:val="MediumGrid1-Accent21"/>
+        <w:contextualSpacing/>
+        <w:jc w:val="both"/>
+        <w:rPr>
+          <w:b/>
+        </w:rPr>
+      </w:pPr>
+    </w:p>
+    <w:p>
+      <w:r>
+        <w:t>Both Parties shall be joint owners of any intellectual property rights in data or materials generated during the course of project activities. With regard to data collected in Rwanda, the MOH is free to further develop, publish, share</w:t>
+      </w:r>
+      <w:r>
+        <w:t>,</w:t>
+      </w:r>
+      <w:r>
+        <w:t xml:space="preserve"> or otherwise use such data or material, but </w:t>
+      </w:r>
+      <w:r>
+        <w:t>{ORGANIZATION_NAME}</w:t>
+      </w:r>
+      <w:r>
+        <w:t xml:space="preserve"> may do so only with the prior consultations with the MOH and </w:t>
+      </w:r>
+      <w:r>
         <w:lastRenderedPageBreak/>
-        <w:t>Intellectual Property Ownership</w:t>
-      </w:r>
-    </w:p>
-    <w:p>
-      <w:pPr>
-        <w:pStyle w:val="MediumGrid1-Accent2"/>
-        <w:contextualSpacing/>
-        <w:jc w:val="both"/>
-        <w:rPr>
-          <w:b/>
-        </w:rPr>
-      </w:pPr>
-    </w:p>
-    <w:p>
-      <w:r>
-        <w:t>Both Parties shall be joint owners of any intellectual property rights in data or materials generated during the course of project activities. With regard to data collected in Rwanda, the MOH is free to further develop, publish, share</w:t>
-      </w:r>
-      <w:r>
-        <w:t>,</w:t>
-      </w:r>
-      <w:r>
-        <w:t xml:space="preserve"> or otherwise use such data or material, but </w:t>
-      </w:r>
-      <w:r>
-        <w:t>{ORGANIZATION_NAME}</w:t>
-      </w:r>
-      <w:r>
-        <w:t xml:space="preserve"> may do so only with the prior consultations with the MOH and within the limits of the Rwanda law on Data Protection and Privacy. Both Parties agree to properly attribute authorship or contributions of the other in any publications that inclu</w:t>
+        <w:t>within the limits of the Rwanda law on Data Protection and Privacy. Both Parties agree to properly attribute authorship or contributions of the other in any publications that inclu</w:t>
       </w:r>
       <w:r>
         <w:t>de any such data or material.</w:t>
@@ -2196,14 +2136,6 @@
       <w:r>
         <w:t xml:space="preserve">  </w:t>
       </w:r>
-    </w:p>
-    <w:p>
-      <w:pPr>
-        <w:autoSpaceDE w:val="0"/>
-        <w:autoSpaceDN w:val="0"/>
-        <w:adjustRightInd w:val="0"/>
-        <w:jc w:val="both"/>
-      </w:pPr>
     </w:p>
     <w:p>
       <w:pPr>
@@ -2399,7 +2331,7 @@
     </w:p>
     <w:p>
       <w:pPr>
-        <w:pStyle w:val="MediumGrid1-Accent2"/>
+        <w:pStyle w:val="MediumGrid1-Accent21"/>
         <w:numPr>
           <w:ilvl w:val="0"/>
           <w:numId w:val="5"/>
@@ -2558,124 +2490,115 @@
           <w:b w:val="0"/>
           <w:szCs w:val="24"/>
         </w:rPr>
-        <w:t>{DATE}.</w:t>
-      </w:r>
-    </w:p>
-    <w:p>
-      <w:pPr>
-        <w:spacing w:after="120"/>
-        <w:jc w:val="both"/>
-      </w:pPr>
-    </w:p>
+        <w:t>{DATE}</w:t>
+      </w:r>
+      <w:r>
+        <w:rPr>
+          <w:rFonts w:ascii="Times New Roman" w:hAnsi="Times New Roman"/>
+          <w:b w:val="0"/>
+          <w:szCs w:val="24"/>
+        </w:rPr>
+        <w:t>.</w:t>
+      </w:r>
+    </w:p>
+    <w:p/>
     <w:p>
       <w:pPr>
         <w:jc w:val="center"/>
         <w:rPr>
           <w:rStyle w:val="description"/>
+        </w:rPr>
+      </w:pPr>
+      <w:r>
+        <w:rPr>
+          <w:rStyle w:val="description"/>
           <w:b/>
           <w:bCs/>
           <w:u w:val="single"/>
         </w:rPr>
-      </w:pPr>
-    </w:p>
-    <w:p>
-      <w:pPr>
-        <w:jc w:val="center"/>
+        <w:t>THE PARTIES</w:t>
+      </w:r>
+    </w:p>
+    <w:p>
+      <w:pPr>
+        <w:jc w:val="both"/>
         <w:rPr>
           <w:rStyle w:val="description"/>
-          <w:b/>
-          <w:bCs/>
-          <w:u w:val="single"/>
-        </w:rPr>
-      </w:pPr>
-    </w:p>
-    <w:p>
-      <w:pPr>
-        <w:jc w:val="center"/>
+        </w:rPr>
+      </w:pPr>
+    </w:p>
+    <w:p>
+      <w:pPr>
+        <w:jc w:val="both"/>
         <w:rPr>
           <w:rStyle w:val="description"/>
-          <w:b/>
-          <w:bCs/>
-          <w:u w:val="single"/>
-        </w:rPr>
-      </w:pPr>
-    </w:p>
-    <w:p>
-      <w:pPr>
-        <w:jc w:val="center"/>
+        </w:rPr>
+      </w:pPr>
+    </w:p>
+    <w:p>
+      <w:pPr>
         <w:rPr>
           <w:rStyle w:val="description"/>
           <w:b/>
           <w:bCs/>
-          <w:u w:val="single"/>
-        </w:rPr>
-      </w:pPr>
-    </w:p>
-    <w:p>
-      <w:pPr>
-        <w:jc w:val="center"/>
+        </w:rPr>
+      </w:pPr>
+      <w:r>
         <w:rPr>
           <w:rStyle w:val="description"/>
           <w:b/>
           <w:bCs/>
-          <w:u w:val="single"/>
-        </w:rPr>
-      </w:pPr>
-    </w:p>
-    <w:p>
-      <w:pPr>
-        <w:jc w:val="center"/>
+        </w:rPr>
+        <w:t>On Behalf of the</w:t>
+      </w:r>
+      <w:r>
         <w:rPr>
           <w:rStyle w:val="description"/>
           <w:b/>
           <w:bCs/>
-          <w:u w:val="single"/>
-        </w:rPr>
-      </w:pPr>
-    </w:p>
-    <w:p>
-      <w:pPr>
-        <w:jc w:val="center"/>
+        </w:rPr>
+        <w:t xml:space="preserve"> </w:t>
+      </w:r>
+      <w:r>
         <w:rPr>
           <w:rStyle w:val="description"/>
           <w:b/>
           <w:bCs/>
-          <w:u w:val="single"/>
-        </w:rPr>
-      </w:pPr>
-    </w:p>
-    <w:p>
-      <w:pPr>
-        <w:jc w:val="center"/>
+        </w:rPr>
+        <w:tab/>
+      </w:r>
+      <w:r>
         <w:rPr>
           <w:rStyle w:val="description"/>
-        </w:rPr>
-      </w:pPr>
+          <w:b/>
+          <w:bCs/>
+        </w:rPr>
+        <w:tab/>
+      </w:r>
       <w:r>
         <w:rPr>
           <w:rStyle w:val="description"/>
           <w:b/>
           <w:bCs/>
-          <w:u w:val="single"/>
-        </w:rPr>
-        <w:t>THE PARTIES</w:t>
-      </w:r>
-    </w:p>
-    <w:p>
-      <w:pPr>
-        <w:jc w:val="both"/>
+        </w:rPr>
+        <w:tab/>
+      </w:r>
+      <w:r>
         <w:rPr>
           <w:rStyle w:val="description"/>
-        </w:rPr>
-      </w:pPr>
-    </w:p>
-    <w:p>
-      <w:pPr>
-        <w:jc w:val="both"/>
+          <w:b/>
+          <w:bCs/>
+        </w:rPr>
+        <w:t xml:space="preserve">                               </w:t>
+      </w:r>
+      <w:r>
         <w:rPr>
           <w:rStyle w:val="description"/>
-        </w:rPr>
-      </w:pPr>
+          <w:b/>
+          <w:bCs/>
+        </w:rPr>
+        <w:t xml:space="preserve">On Behalf of </w:t>
+      </w:r>
     </w:p>
     <w:p>
       <w:pPr>
@@ -2691,7 +2614,7 @@
           <w:b/>
           <w:bCs/>
         </w:rPr>
-        <w:t>On Behalf of the</w:t>
+        <w:t xml:space="preserve">Government of Rwanda </w:t>
       </w:r>
       <w:r>
         <w:rPr>
@@ -2699,7 +2622,7 @@
           <w:b/>
           <w:bCs/>
         </w:rPr>
-        <w:t xml:space="preserve"> </w:t>
+        <w:t xml:space="preserve">                    </w:t>
       </w:r>
       <w:r>
         <w:rPr>
@@ -2707,6 +2630,22 @@
           <w:b/>
           <w:bCs/>
         </w:rPr>
+        <w:t>And</w:t>
+      </w:r>
+      <w:r>
+        <w:rPr>
+          <w:rStyle w:val="description"/>
+          <w:b/>
+          <w:bCs/>
+        </w:rPr>
+        <w:t xml:space="preserve">      </w:t>
+      </w:r>
+      <w:r>
+        <w:rPr>
+          <w:rStyle w:val="description"/>
+          <w:b/>
+          <w:bCs/>
+        </w:rPr>
         <w:tab/>
       </w:r>
       <w:r>
@@ -2715,15 +2654,16 @@
           <w:b/>
           <w:bCs/>
         </w:rPr>
-        <w:tab/>
-      </w:r>
+        <w:t xml:space="preserve">    </w:t>
+      </w:r>
+      <w:proofErr w:type="gramStart"/>
       <w:r>
         <w:rPr>
           <w:rStyle w:val="description"/>
           <w:b/>
           <w:bCs/>
         </w:rPr>
-        <w:tab/>
+        <w:t xml:space="preserve">   </w:t>
       </w:r>
       <w:r>
         <w:rPr>
@@ -2731,90 +2671,26 @@
           <w:b/>
           <w:bCs/>
         </w:rPr>
-        <w:tab/>
-      </w:r>
+        <w:t>{</w:t>
+      </w:r>
+      <w:proofErr w:type="gramEnd"/>
       <w:r>
         <w:rPr>
           <w:rStyle w:val="description"/>
           <w:b/>
           <w:bCs/>
         </w:rPr>
-        <w:tab/>
-      </w:r>
-      <w:r>
+        <w:t>ORGANIZATION_NAME}</w:t>
+      </w:r>
+    </w:p>
+    <w:p>
+      <w:pPr>
         <w:rPr>
           <w:rStyle w:val="description"/>
           <w:b/>
           <w:bCs/>
         </w:rPr>
-        <w:t xml:space="preserve">On Behalf of </w:t>
-      </w:r>
-      <w:r>
-        <w:rPr>
-          <w:rStyle w:val="description"/>
-          <w:b/>
-          <w:bCs/>
-        </w:rPr>
-        <w:t>{ORGANIZATION_NAME}</w:t>
-      </w:r>
-    </w:p>
-    <w:p>
-      <w:pPr>
-        <w:rPr>
-          <w:rStyle w:val="description"/>
-          <w:b/>
-          <w:bCs/>
-        </w:rPr>
-      </w:pPr>
-      <w:r>
-        <w:rPr>
-          <w:rStyle w:val="description"/>
-          <w:b/>
-          <w:bCs/>
-        </w:rPr>
-        <w:lastRenderedPageBreak/>
-        <w:t xml:space="preserve">Government of Rwanda </w:t>
-      </w:r>
-      <w:r>
-        <w:rPr>
-          <w:rStyle w:val="description"/>
-          <w:b/>
-          <w:bCs/>
-        </w:rPr>
-        <w:t xml:space="preserve">                    </w:t>
-      </w:r>
-      <w:r>
-        <w:rPr>
-          <w:rStyle w:val="description"/>
-          <w:b/>
-          <w:bCs/>
-        </w:rPr>
-        <w:t>And</w:t>
-      </w:r>
-      <w:r>
-        <w:rPr>
-          <w:rStyle w:val="description"/>
-          <w:b/>
-          <w:bCs/>
-        </w:rPr>
-        <w:t xml:space="preserve">      </w:t>
-      </w:r>
-      <w:r>
-        <w:rPr>
-          <w:rStyle w:val="description"/>
-          <w:b/>
-          <w:bCs/>
-        </w:rPr>
-        <w:tab/>
-      </w:r>
-      <w:r>
-        <w:rPr>
-          <w:rStyle w:val="description"/>
-          <w:b/>
-          <w:bCs/>
-        </w:rPr>
-        <w:tab/>
-      </w:r>
+      </w:pPr>
     </w:p>
     <w:p>
       <w:pPr>
@@ -3171,7 +3047,7 @@
 </file>
 
 <file path=word/endnotes.xml><?xml version="1.0" encoding="utf-8"?>
-<w:endnotes xmlns:wpc="http://schemas.microsoft.com/office/word/2010/wordprocessingCanvas" xmlns:cx="http://schemas.microsoft.com/office/drawing/2014/chartex" xmlns:cx1="http://schemas.microsoft.com/office/drawing/2015/9/8/chartex" xmlns:cx2="http://schemas.microsoft.com/office/drawing/2015/10/21/chartex" xmlns:cx3="http://schemas.microsoft.com/office/drawing/2016/5/9/chartex" xmlns:cx4="http://schemas.microsoft.com/office/drawing/2016/5/10/chartex" xmlns:cx5="http://schemas.microsoft.com/office/drawing/2016/5/11/chartex" xmlns:cx6="http://schemas.microsoft.com/office/drawing/2016/5/12/chartex" xmlns:cx7="http://schemas.microsoft.com/office/drawing/2016/5/13/chartex" xmlns:cx8="http://schemas.microsoft.com/office/drawing/2016/5/14/chartex" xmlns:mc="http://schemas.openxmlformats.org/markup-compatibility/2006" xmlns:aink="http://schemas.microsoft.com/office/drawing/2016/ink" xmlns:am3d="http://schemas.microsoft.com/office/drawing/2017/model3d" xmlns:o="urn:schemas-microsoft-com:office:office" xmlns:r="http://schemas.openxmlformats.org/officeDocument/2006/relationships" xmlns:m="http://schemas.openxmlformats.org/officeDocument/2006/math" xmlns:v="urn:schemas-microsoft-com:vml" xmlns:wp14="http://schemas.microsoft.com/office/word/2010/wordprocessingDrawing" xmlns:wp="http://schemas.openxmlformats.org/drawingml/2006/wordprocessingDrawing" xmlns:w10="urn:schemas-microsoft-com:office:word" xmlns:w="http://schemas.openxmlformats.org/wordprocessingml/2006/main" xmlns:w14="http://schemas.microsoft.com/office/word/2010/wordml" xmlns:w15="http://schemas.microsoft.com/office/word/2012/wordml" xmlns:w16cex="http://schemas.microsoft.com/office/word/2018/wordml/cex" xmlns:w16cid="http://schemas.microsoft.com/office/word/2016/wordml/cid" xmlns:w16="http://schemas.microsoft.com/office/word/2018/wordml" xmlns:w16sdtdh="http://schemas.microsoft.com/office/word/2020/wordml/sdtdatahash" xmlns:w16se="http://schemas.microsoft.com/office/word/2015/wordml/symex" xmlns:wpg="http://schemas.microsoft.com/office/word/2010/wordprocessingGroup" xmlns:wpi="http://schemas.microsoft.com/office/word/2010/wordprocessingInk" xmlns:wne="http://schemas.microsoft.com/office/word/2006/wordml" xmlns:wps="http://schemas.microsoft.com/office/word/2010/wordprocessingShape" mc:Ignorable="w14 w15 w16se w16cid w16 w16cex w16sdtdh wp14">
+<w:endnotes xmlns:wpc="http://schemas.microsoft.com/office/word/2010/wordprocessingCanvas" xmlns:cx="http://schemas.microsoft.com/office/drawing/2014/chartex" xmlns:cx1="http://schemas.microsoft.com/office/drawing/2015/9/8/chartex" xmlns:cx2="http://schemas.microsoft.com/office/drawing/2015/10/21/chartex" xmlns:cx3="http://schemas.microsoft.com/office/drawing/2016/5/9/chartex" xmlns:cx4="http://schemas.microsoft.com/office/drawing/2016/5/10/chartex" xmlns:cx5="http://schemas.microsoft.com/office/drawing/2016/5/11/chartex" xmlns:cx6="http://schemas.microsoft.com/office/drawing/2016/5/12/chartex" xmlns:cx7="http://schemas.microsoft.com/office/drawing/2016/5/13/chartex" xmlns:cx8="http://schemas.microsoft.com/office/drawing/2016/5/14/chartex" xmlns:mc="http://schemas.openxmlformats.org/markup-compatibility/2006" xmlns:aink="http://schemas.microsoft.com/office/drawing/2016/ink" xmlns:am3d="http://schemas.microsoft.com/office/drawing/2017/model3d" xmlns:o="urn:schemas-microsoft-com:office:office" xmlns:oel="http://schemas.microsoft.com/office/2019/extlst" xmlns:r="http://schemas.openxmlformats.org/officeDocument/2006/relationships" xmlns:m="http://schemas.openxmlformats.org/officeDocument/2006/math" xmlns:v="urn:schemas-microsoft-com:vml" xmlns:wp14="http://schemas.microsoft.com/office/word/2010/wordprocessingDrawing" xmlns:wp="http://schemas.openxmlformats.org/drawingml/2006/wordprocessingDrawing" xmlns:w10="urn:schemas-microsoft-com:office:word" xmlns:w="http://schemas.openxmlformats.org/wordprocessingml/2006/main" xmlns:w14="http://schemas.microsoft.com/office/word/2010/wordml" xmlns:w15="http://schemas.microsoft.com/office/word/2012/wordml" xmlns:w16cex="http://schemas.microsoft.com/office/word/2018/wordml/cex" xmlns:w16cid="http://schemas.microsoft.com/office/word/2016/wordml/cid" xmlns:w16="http://schemas.microsoft.com/office/word/2018/wordml" xmlns:w16du="http://schemas.microsoft.com/office/word/2023/wordml/word16du" xmlns:w16sdtdh="http://schemas.microsoft.com/office/word/2020/wordml/sdtdatahash" xmlns:w16se="http://schemas.microsoft.com/office/word/2015/wordml/symex" xmlns:wpg="http://schemas.microsoft.com/office/word/2010/wordprocessingGroup" xmlns:wpi="http://schemas.microsoft.com/office/word/2010/wordprocessingInk" xmlns:wne="http://schemas.microsoft.com/office/word/2006/wordml" xmlns:wps="http://schemas.microsoft.com/office/word/2010/wordprocessingShape" mc:Ignorable="w14 w15 w16se w16cid w16 w16cex w16sdtdh w16du wp14">
   <w:endnote w:type="separator" w:id="-1">
     <w:p>
       <w:r>
@@ -3190,7 +3066,7 @@
 </file>
 
 <file path=word/footer1.xml><?xml version="1.0" encoding="utf-8"?>
-<w:ftr xmlns:wpc="http://schemas.microsoft.com/office/word/2010/wordprocessingCanvas" xmlns:cx="http://schemas.microsoft.com/office/drawing/2014/chartex" xmlns:cx1="http://schemas.microsoft.com/office/drawing/2015/9/8/chartex" xmlns:cx2="http://schemas.microsoft.com/office/drawing/2015/10/21/chartex" xmlns:cx3="http://schemas.microsoft.com/office/drawing/2016/5/9/chartex" xmlns:cx4="http://schemas.microsoft.com/office/drawing/2016/5/10/chartex" xmlns:cx5="http://schemas.microsoft.com/office/drawing/2016/5/11/chartex" xmlns:cx6="http://schemas.microsoft.com/office/drawing/2016/5/12/chartex" xmlns:cx7="http://schemas.microsoft.com/office/drawing/2016/5/13/chartex" xmlns:cx8="http://schemas.microsoft.com/office/drawing/2016/5/14/chartex" xmlns:mc="http://schemas.openxmlformats.org/markup-compatibility/2006" xmlns:aink="http://schemas.microsoft.com/office/drawing/2016/ink" xmlns:am3d="http://schemas.microsoft.com/office/drawing/2017/model3d" xmlns:o="urn:schemas-microsoft-com:office:office" xmlns:r="http://schemas.openxmlformats.org/officeDocument/2006/relationships" xmlns:m="http://schemas.openxmlformats.org/officeDocument/2006/math" xmlns:v="urn:schemas-microsoft-com:vml" xmlns:wp14="http://schemas.microsoft.com/office/word/2010/wordprocessingDrawing" xmlns:wp="http://schemas.openxmlformats.org/drawingml/2006/wordprocessingDrawing" xmlns:w10="urn:schemas-microsoft-com:office:word" xmlns:w="http://schemas.openxmlformats.org/wordprocessingml/2006/main" xmlns:w14="http://schemas.microsoft.com/office/word/2010/wordml" xmlns:w15="http://schemas.microsoft.com/office/word/2012/wordml" xmlns:w16cex="http://schemas.microsoft.com/office/word/2018/wordml/cex" xmlns:w16cid="http://schemas.microsoft.com/office/word/2016/wordml/cid" xmlns:w16="http://schemas.microsoft.com/office/word/2018/wordml" xmlns:w16sdtdh="http://schemas.microsoft.com/office/word/2020/wordml/sdtdatahash" xmlns:w16se="http://schemas.microsoft.com/office/word/2015/wordml/symex" xmlns:wpg="http://schemas.microsoft.com/office/word/2010/wordprocessingGroup" xmlns:wpi="http://schemas.microsoft.com/office/word/2010/wordprocessingInk" xmlns:wne="http://schemas.microsoft.com/office/word/2006/wordml" xmlns:wps="http://schemas.microsoft.com/office/word/2010/wordprocessingShape" mc:Ignorable="w14 w15 w16se w16cid w16 w16cex w16sdtdh wp14">
+<w:ftr xmlns:wpc="http://schemas.microsoft.com/office/word/2010/wordprocessingCanvas" xmlns:cx="http://schemas.microsoft.com/office/drawing/2014/chartex" xmlns:cx1="http://schemas.microsoft.com/office/drawing/2015/9/8/chartex" xmlns:cx2="http://schemas.microsoft.com/office/drawing/2015/10/21/chartex" xmlns:cx3="http://schemas.microsoft.com/office/drawing/2016/5/9/chartex" xmlns:cx4="http://schemas.microsoft.com/office/drawing/2016/5/10/chartex" xmlns:cx5="http://schemas.microsoft.com/office/drawing/2016/5/11/chartex" xmlns:cx6="http://schemas.microsoft.com/office/drawing/2016/5/12/chartex" xmlns:cx7="http://schemas.microsoft.com/office/drawing/2016/5/13/chartex" xmlns:cx8="http://schemas.microsoft.com/office/drawing/2016/5/14/chartex" xmlns:mc="http://schemas.openxmlformats.org/markup-compatibility/2006" xmlns:aink="http://schemas.microsoft.com/office/drawing/2016/ink" xmlns:am3d="http://schemas.microsoft.com/office/drawing/2017/model3d" xmlns:o="urn:schemas-microsoft-com:office:office" xmlns:oel="http://schemas.microsoft.com/office/2019/extlst" xmlns:r="http://schemas.openxmlformats.org/officeDocument/2006/relationships" xmlns:m="http://schemas.openxmlformats.org/officeDocument/2006/math" xmlns:v="urn:schemas-microsoft-com:vml" xmlns:wp14="http://schemas.microsoft.com/office/word/2010/wordprocessingDrawing" xmlns:wp="http://schemas.openxmlformats.org/drawingml/2006/wordprocessingDrawing" xmlns:w10="urn:schemas-microsoft-com:office:word" xmlns:w="http://schemas.openxmlformats.org/wordprocessingml/2006/main" xmlns:w14="http://schemas.microsoft.com/office/word/2010/wordml" xmlns:w15="http://schemas.microsoft.com/office/word/2012/wordml" xmlns:w16cex="http://schemas.microsoft.com/office/word/2018/wordml/cex" xmlns:w16cid="http://schemas.microsoft.com/office/word/2016/wordml/cid" xmlns:w16="http://schemas.microsoft.com/office/word/2018/wordml" xmlns:w16du="http://schemas.microsoft.com/office/word/2023/wordml/word16du" xmlns:w16sdtdh="http://schemas.microsoft.com/office/word/2020/wordml/sdtdatahash" xmlns:w16se="http://schemas.microsoft.com/office/word/2015/wordml/symex" xmlns:wpg="http://schemas.microsoft.com/office/word/2010/wordprocessingGroup" xmlns:wpi="http://schemas.microsoft.com/office/word/2010/wordprocessingInk" xmlns:wne="http://schemas.microsoft.com/office/word/2006/wordml" xmlns:wps="http://schemas.microsoft.com/office/word/2010/wordprocessingShape" mc:Ignorable="w14 w15 w16se w16cid w16 w16cex w16sdtdh w16du wp14">
   <w:p>
     <w:pPr>
       <w:pStyle w:val="Footer"/>
@@ -3224,7 +3100,7 @@
 </file>
 
 <file path=word/footnotes.xml><?xml version="1.0" encoding="utf-8"?>
-<w:footnotes xmlns:wpc="http://schemas.microsoft.com/office/word/2010/wordprocessingCanvas" xmlns:cx="http://schemas.microsoft.com/office/drawing/2014/chartex" xmlns:cx1="http://schemas.microsoft.com/office/drawing/2015/9/8/chartex" xmlns:cx2="http://schemas.microsoft.com/office/drawing/2015/10/21/chartex" xmlns:cx3="http://schemas.microsoft.com/office/drawing/2016/5/9/chartex" xmlns:cx4="http://schemas.microsoft.com/office/drawing/2016/5/10/chartex" xmlns:cx5="http://schemas.microsoft.com/office/drawing/2016/5/11/chartex" xmlns:cx6="http://schemas.microsoft.com/office/drawing/2016/5/12/chartex" xmlns:cx7="http://schemas.microsoft.com/office/drawing/2016/5/13/chartex" xmlns:cx8="http://schemas.microsoft.com/office/drawing/2016/5/14/chartex" xmlns:mc="http://schemas.openxmlformats.org/markup-compatibility/2006" xmlns:aink="http://schemas.microsoft.com/office/drawing/2016/ink" xmlns:am3d="http://schemas.microsoft.com/office/drawing/2017/model3d" xmlns:o="urn:schemas-microsoft-com:office:office" xmlns:r="http://schemas.openxmlformats.org/officeDocument/2006/relationships" xmlns:m="http://schemas.openxmlformats.org/officeDocument/2006/math" xmlns:v="urn:schemas-microsoft-com:vml" xmlns:wp14="http://schemas.microsoft.com/office/word/2010/wordprocessingDrawing" xmlns:wp="http://schemas.openxmlformats.org/drawingml/2006/wordprocessingDrawing" xmlns:w10="urn:schemas-microsoft-com:office:word" xmlns:w="http://schemas.openxmlformats.org/wordprocessingml/2006/main" xmlns:w14="http://schemas.microsoft.com/office/word/2010/wordml" xmlns:w15="http://schemas.microsoft.com/office/word/2012/wordml" xmlns:w16cex="http://schemas.microsoft.com/office/word/2018/wordml/cex" xmlns:w16cid="http://schemas.microsoft.com/office/word/2016/wordml/cid" xmlns:w16="http://schemas.microsoft.com/office/word/2018/wordml" xmlns:w16sdtdh="http://schemas.microsoft.com/office/word/2020/wordml/sdtdatahash" xmlns:w16se="http://schemas.microsoft.com/office/word/2015/wordml/symex" xmlns:wpg="http://schemas.microsoft.com/office/word/2010/wordprocessingGroup" xmlns:wpi="http://schemas.microsoft.com/office/word/2010/wordprocessingInk" xmlns:wne="http://schemas.microsoft.com/office/word/2006/wordml" xmlns:wps="http://schemas.microsoft.com/office/word/2010/wordprocessingShape" mc:Ignorable="w14 w15 w16se w16cid w16 w16cex w16sdtdh wp14">
+<w:footnotes xmlns:wpc="http://schemas.microsoft.com/office/word/2010/wordprocessingCanvas" xmlns:cx="http://schemas.microsoft.com/office/drawing/2014/chartex" xmlns:cx1="http://schemas.microsoft.com/office/drawing/2015/9/8/chartex" xmlns:cx2="http://schemas.microsoft.com/office/drawing/2015/10/21/chartex" xmlns:cx3="http://schemas.microsoft.com/office/drawing/2016/5/9/chartex" xmlns:cx4="http://schemas.microsoft.com/office/drawing/2016/5/10/chartex" xmlns:cx5="http://schemas.microsoft.com/office/drawing/2016/5/11/chartex" xmlns:cx6="http://schemas.microsoft.com/office/drawing/2016/5/12/chartex" xmlns:cx7="http://schemas.microsoft.com/office/drawing/2016/5/13/chartex" xmlns:cx8="http://schemas.microsoft.com/office/drawing/2016/5/14/chartex" xmlns:mc="http://schemas.openxmlformats.org/markup-compatibility/2006" xmlns:aink="http://schemas.microsoft.com/office/drawing/2016/ink" xmlns:am3d="http://schemas.microsoft.com/office/drawing/2017/model3d" xmlns:o="urn:schemas-microsoft-com:office:office" xmlns:oel="http://schemas.microsoft.com/office/2019/extlst" xmlns:r="http://schemas.openxmlformats.org/officeDocument/2006/relationships" xmlns:m="http://schemas.openxmlformats.org/officeDocument/2006/math" xmlns:v="urn:schemas-microsoft-com:vml" xmlns:wp14="http://schemas.microsoft.com/office/word/2010/wordprocessingDrawing" xmlns:wp="http://schemas.openxmlformats.org/drawingml/2006/wordprocessingDrawing" xmlns:w10="urn:schemas-microsoft-com:office:word" xmlns:w="http://schemas.openxmlformats.org/wordprocessingml/2006/main" xmlns:w14="http://schemas.microsoft.com/office/word/2010/wordml" xmlns:w15="http://schemas.microsoft.com/office/word/2012/wordml" xmlns:w16cex="http://schemas.microsoft.com/office/word/2018/wordml/cex" xmlns:w16cid="http://schemas.microsoft.com/office/word/2016/wordml/cid" xmlns:w16="http://schemas.microsoft.com/office/word/2018/wordml" xmlns:w16du="http://schemas.microsoft.com/office/word/2023/wordml/word16du" xmlns:w16sdtdh="http://schemas.microsoft.com/office/word/2020/wordml/sdtdatahash" xmlns:w16se="http://schemas.microsoft.com/office/word/2015/wordml/symex" xmlns:wpg="http://schemas.microsoft.com/office/word/2010/wordprocessingGroup" xmlns:wpi="http://schemas.microsoft.com/office/word/2010/wordprocessingInk" xmlns:wne="http://schemas.microsoft.com/office/word/2006/wordml" xmlns:wps="http://schemas.microsoft.com/office/word/2010/wordprocessingShape" mc:Ignorable="w14 w15 w16se w16cid w16 w16cex w16sdtdh w16du wp14">
   <w:footnote w:type="separator" w:id="-1">
     <w:p>
       <w:r>
@@ -3243,7 +3119,7 @@
 </file>
 
 <file path=word/numbering.xml><?xml version="1.0" encoding="utf-8"?>
-<w:numbering xmlns:wpc="http://schemas.microsoft.com/office/word/2010/wordprocessingCanvas" xmlns:cx="http://schemas.microsoft.com/office/drawing/2014/chartex" xmlns:cx1="http://schemas.microsoft.com/office/drawing/2015/9/8/chartex" xmlns:cx2="http://schemas.microsoft.com/office/drawing/2015/10/21/chartex" xmlns:cx3="http://schemas.microsoft.com/office/drawing/2016/5/9/chartex" xmlns:cx4="http://schemas.microsoft.com/office/drawing/2016/5/10/chartex" xmlns:cx5="http://schemas.microsoft.com/office/drawing/2016/5/11/chartex" xmlns:cx6="http://schemas.microsoft.com/office/drawing/2016/5/12/chartex" xmlns:cx7="http://schemas.microsoft.com/office/drawing/2016/5/13/chartex" xmlns:cx8="http://schemas.microsoft.com/office/drawing/2016/5/14/chartex" xmlns:mc="http://schemas.openxmlformats.org/markup-compatibility/2006" xmlns:aink="http://schemas.microsoft.com/office/drawing/2016/ink" xmlns:am3d="http://schemas.microsoft.com/office/drawing/2017/model3d" xmlns:o="urn:schemas-microsoft-com:office:office" xmlns:r="http://schemas.openxmlformats.org/officeDocument/2006/relationships" xmlns:m="http://schemas.openxmlformats.org/officeDocument/2006/math" xmlns:v="urn:schemas-microsoft-com:vml" xmlns:wp14="http://schemas.microsoft.com/office/word/2010/wordprocessingDrawing" xmlns:wp="http://schemas.openxmlformats.org/drawingml/2006/wordprocessingDrawing" xmlns:w10="urn:schemas-microsoft-com:office:word" xmlns:w="http://schemas.openxmlformats.org/wordprocessingml/2006/main" xmlns:w14="http://schemas.microsoft.com/office/word/2010/wordml" xmlns:w15="http://schemas.microsoft.com/office/word/2012/wordml" xmlns:w16cex="http://schemas.microsoft.com/office/word/2018/wordml/cex" xmlns:w16cid="http://schemas.microsoft.com/office/word/2016/wordml/cid" xmlns:w16="http://schemas.microsoft.com/office/word/2018/wordml" xmlns:w16sdtdh="http://schemas.microsoft.com/office/word/2020/wordml/sdtdatahash" xmlns:w16se="http://schemas.microsoft.com/office/word/2015/wordml/symex" xmlns:wpg="http://schemas.microsoft.com/office/word/2010/wordprocessingGroup" xmlns:wpi="http://schemas.microsoft.com/office/word/2010/wordprocessingInk" xmlns:wne="http://schemas.microsoft.com/office/word/2006/wordml" xmlns:wps="http://schemas.microsoft.com/office/word/2010/wordprocessingShape" mc:Ignorable="w14 w15 w16se w16cid w16 w16cex w16sdtdh wp14">
+<w:numbering xmlns:wpc="http://schemas.microsoft.com/office/word/2010/wordprocessingCanvas" xmlns:cx="http://schemas.microsoft.com/office/drawing/2014/chartex" xmlns:cx1="http://schemas.microsoft.com/office/drawing/2015/9/8/chartex" xmlns:cx2="http://schemas.microsoft.com/office/drawing/2015/10/21/chartex" xmlns:cx3="http://schemas.microsoft.com/office/drawing/2016/5/9/chartex" xmlns:cx4="http://schemas.microsoft.com/office/drawing/2016/5/10/chartex" xmlns:cx5="http://schemas.microsoft.com/office/drawing/2016/5/11/chartex" xmlns:cx6="http://schemas.microsoft.com/office/drawing/2016/5/12/chartex" xmlns:cx7="http://schemas.microsoft.com/office/drawing/2016/5/13/chartex" xmlns:cx8="http://schemas.microsoft.com/office/drawing/2016/5/14/chartex" xmlns:mc="http://schemas.openxmlformats.org/markup-compatibility/2006" xmlns:aink="http://schemas.microsoft.com/office/drawing/2016/ink" xmlns:am3d="http://schemas.microsoft.com/office/drawing/2017/model3d" xmlns:o="urn:schemas-microsoft-com:office:office" xmlns:oel="http://schemas.microsoft.com/office/2019/extlst" xmlns:r="http://schemas.openxmlformats.org/officeDocument/2006/relationships" xmlns:m="http://schemas.openxmlformats.org/officeDocument/2006/math" xmlns:v="urn:schemas-microsoft-com:vml" xmlns:wp14="http://schemas.microsoft.com/office/word/2010/wordprocessingDrawing" xmlns:wp="http://schemas.openxmlformats.org/drawingml/2006/wordprocessingDrawing" xmlns:w10="urn:schemas-microsoft-com:office:word" xmlns:w="http://schemas.openxmlformats.org/wordprocessingml/2006/main" xmlns:w14="http://schemas.microsoft.com/office/word/2010/wordml" xmlns:w15="http://schemas.microsoft.com/office/word/2012/wordml" xmlns:w16cex="http://schemas.microsoft.com/office/word/2018/wordml/cex" xmlns:w16cid="http://schemas.microsoft.com/office/word/2016/wordml/cid" xmlns:w16="http://schemas.microsoft.com/office/word/2018/wordml" xmlns:w16du="http://schemas.microsoft.com/office/word/2023/wordml/word16du" xmlns:w16sdtdh="http://schemas.microsoft.com/office/word/2020/wordml/sdtdatahash" xmlns:w16se="http://schemas.microsoft.com/office/word/2015/wordml/symex" xmlns:wpg="http://schemas.microsoft.com/office/word/2010/wordprocessingGroup" xmlns:wpi="http://schemas.microsoft.com/office/word/2010/wordprocessingInk" xmlns:wne="http://schemas.microsoft.com/office/word/2006/wordml" xmlns:wps="http://schemas.microsoft.com/office/word/2010/wordprocessingShape" mc:Ignorable="w14 w15 w16se w16cid w16 w16cex w16sdtdh w16du wp14">
   <w:abstractNum w:abstractNumId="0" w15:restartNumberingAfterBreak="0">
     <w:nsid w:val="FFFFFF1D"/>
     <w:multiLevelType w:val="multilevel"/>
@@ -4981,49 +4857,49 @@
       </w:pPr>
     </w:lvl>
   </w:abstractNum>
-  <w:num w:numId="1">
+  <w:num w:numId="1" w16cid:durableId="3095140">
     <w:abstractNumId w:val="6"/>
   </w:num>
-  <w:num w:numId="2">
+  <w:num w:numId="2" w16cid:durableId="892348888">
     <w:abstractNumId w:val="12"/>
   </w:num>
-  <w:num w:numId="3">
+  <w:num w:numId="3" w16cid:durableId="1436173738">
     <w:abstractNumId w:val="11"/>
   </w:num>
-  <w:num w:numId="4">
+  <w:num w:numId="4" w16cid:durableId="1495681376">
     <w:abstractNumId w:val="3"/>
   </w:num>
-  <w:num w:numId="5">
+  <w:num w:numId="5" w16cid:durableId="813765089">
     <w:abstractNumId w:val="7"/>
   </w:num>
-  <w:num w:numId="6">
+  <w:num w:numId="6" w16cid:durableId="148600052">
     <w:abstractNumId w:val="2"/>
   </w:num>
-  <w:num w:numId="7">
+  <w:num w:numId="7" w16cid:durableId="1647005846">
     <w:abstractNumId w:val="1"/>
   </w:num>
-  <w:num w:numId="8">
+  <w:num w:numId="8" w16cid:durableId="936137982">
     <w:abstractNumId w:val="16"/>
   </w:num>
-  <w:num w:numId="9">
+  <w:num w:numId="9" w16cid:durableId="1279530499">
     <w:abstractNumId w:val="10"/>
   </w:num>
-  <w:num w:numId="10">
+  <w:num w:numId="10" w16cid:durableId="922495366">
     <w:abstractNumId w:val="8"/>
   </w:num>
-  <w:num w:numId="11">
+  <w:num w:numId="11" w16cid:durableId="998385855">
     <w:abstractNumId w:val="13"/>
   </w:num>
-  <w:num w:numId="12">
+  <w:num w:numId="12" w16cid:durableId="1669212084">
     <w:abstractNumId w:val="4"/>
   </w:num>
-  <w:num w:numId="13">
+  <w:num w:numId="13" w16cid:durableId="2018843406">
     <w:abstractNumId w:val="15"/>
   </w:num>
-  <w:num w:numId="14">
+  <w:num w:numId="14" w16cid:durableId="1139155650">
     <w:abstractNumId w:val="0"/>
   </w:num>
-  <w:num w:numId="15">
+  <w:num w:numId="15" w16cid:durableId="527259862">
     <w:abstractNumId w:val="5"/>
     <w:lvlOverride w:ilvl="0">
       <w:startOverride w:val="1"/>
@@ -5053,17 +4929,17 @@
       <w:startOverride w:val="1"/>
     </w:lvlOverride>
   </w:num>
-  <w:num w:numId="16">
+  <w:num w:numId="16" w16cid:durableId="295574783">
     <w:abstractNumId w:val="9"/>
   </w:num>
-  <w:num w:numId="17">
+  <w:num w:numId="17" w16cid:durableId="1853370625">
     <w:abstractNumId w:val="14"/>
   </w:num>
 </w:numbering>
 </file>
 
 <file path=word/styles.xml><?xml version="1.0" encoding="utf-8"?>
-<w:styles xmlns:mc="http://schemas.openxmlformats.org/markup-compatibility/2006" xmlns:r="http://schemas.openxmlformats.org/officeDocument/2006/relationships" xmlns:w="http://schemas.openxmlformats.org/wordprocessingml/2006/main" xmlns:w14="http://schemas.microsoft.com/office/word/2010/wordml" xmlns:w15="http://schemas.microsoft.com/office/word/2012/wordml" xmlns:w16cex="http://schemas.microsoft.com/office/word/2018/wordml/cex" xmlns:w16cid="http://schemas.microsoft.com/office/word/2016/wordml/cid" xmlns:w16="http://schemas.microsoft.com/office/word/2018/wordml" xmlns:w16sdtdh="http://schemas.microsoft.com/office/word/2020/wordml/sdtdatahash" xmlns:w16se="http://schemas.microsoft.com/office/word/2015/wordml/symex" mc:Ignorable="w14 w15 w16se w16cid w16 w16cex w16sdtdh">
+<w:styles xmlns:mc="http://schemas.openxmlformats.org/markup-compatibility/2006" xmlns:r="http://schemas.openxmlformats.org/officeDocument/2006/relationships" xmlns:w="http://schemas.openxmlformats.org/wordprocessingml/2006/main" xmlns:w14="http://schemas.microsoft.com/office/word/2010/wordml" xmlns:w15="http://schemas.microsoft.com/office/word/2012/wordml" xmlns:w16cex="http://schemas.microsoft.com/office/word/2018/wordml/cex" xmlns:w16cid="http://schemas.microsoft.com/office/word/2016/wordml/cid" xmlns:w16="http://schemas.microsoft.com/office/word/2018/wordml" xmlns:w16du="http://schemas.microsoft.com/office/word/2023/wordml/word16du" xmlns:w16sdtdh="http://schemas.microsoft.com/office/word/2020/wordml/sdtdatahash" xmlns:w16se="http://schemas.microsoft.com/office/word/2015/wordml/symex" mc:Ignorable="w14 w15 w16se w16cid w16 w16cex w16sdtdh w16du">
   <w:docDefaults>
     <w:rPrDefault>
       <w:rPr>
@@ -5348,8 +5224,8 @@
     <w:lsdException w:name="Plain Table 5" w:uiPriority="31" w:qFormat="1"/>
     <w:lsdException w:name="Grid Table Light" w:uiPriority="32" w:qFormat="1"/>
     <w:lsdException w:name="Grid Table 1 Light" w:uiPriority="33" w:qFormat="1"/>
-    <w:lsdException w:name="Grid Table 2" w:semiHidden="1" w:uiPriority="37" w:unhideWhenUsed="1"/>
-    <w:lsdException w:name="Grid Table 3" w:semiHidden="1" w:uiPriority="39" w:unhideWhenUsed="1" w:qFormat="1"/>
+    <w:lsdException w:name="Grid Table 2" w:uiPriority="37"/>
+    <w:lsdException w:name="Grid Table 3" w:uiPriority="39" w:qFormat="1"/>
     <w:lsdException w:name="Grid Table 4" w:uiPriority="49"/>
     <w:lsdException w:name="Grid Table 5 Dark" w:uiPriority="50"/>
     <w:lsdException w:name="Grid Table 6 Colorful" w:uiPriority="51"/>
@@ -5516,6 +5392,7 @@
   <w:style w:type="character" w:default="1" w:styleId="DefaultParagraphFont">
     <w:name w:val="Default Paragraph Font"/>
     <w:uiPriority w:val="1"/>
+    <w:semiHidden/>
     <w:unhideWhenUsed/>
   </w:style>
   <w:style w:type="table" w:default="1" w:styleId="TableNormal">
@@ -5523,7 +5400,6 @@
     <w:uiPriority w:val="99"/>
     <w:semiHidden/>
     <w:unhideWhenUsed/>
-    <w:qFormat/>
     <w:tblPr>
       <w:tblInd w:w="0" w:type="dxa"/>
       <w:tblCellMar>
@@ -5797,8 +5673,8 @@
       <w:lang w:val="en-GB"/>
     </w:rPr>
   </w:style>
-  <w:style w:type="paragraph" w:styleId="MediumGrid1-Accent2">
-    <w:name w:val="Medium Grid 1 Accent 2"/>
+  <w:style w:type="paragraph" w:customStyle="1" w:styleId="MediumGrid1-Accent21">
+    <w:name w:val="Medium Grid 1 - Accent 21"/>
     <w:basedOn w:val="Normal"/>
     <w:uiPriority w:val="72"/>
     <w:qFormat/>

</xml_diff>

<commit_message>
feedback: allow user to create source of fund if it does not exist feedback: add project duration to the mou document
</commit_message>
<xml_diff>
--- a/mou_templates/mou_international.docx
+++ b/mou_templates/mou_international.docx
@@ -1,6 +1,6 @@
 
 <file path=word/document.xml><?xml version="1.0" encoding="utf-8"?>
-<w:document xmlns:wpc="http://schemas.microsoft.com/office/word/2010/wordprocessingCanvas" xmlns:cx="http://schemas.microsoft.com/office/drawing/2014/chartex" xmlns:cx1="http://schemas.microsoft.com/office/drawing/2015/9/8/chartex" xmlns:cx2="http://schemas.microsoft.com/office/drawing/2015/10/21/chartex" xmlns:cx3="http://schemas.microsoft.com/office/drawing/2016/5/9/chartex" xmlns:cx4="http://schemas.microsoft.com/office/drawing/2016/5/10/chartex" xmlns:cx5="http://schemas.microsoft.com/office/drawing/2016/5/11/chartex" xmlns:cx6="http://schemas.microsoft.com/office/drawing/2016/5/12/chartex" xmlns:cx7="http://schemas.microsoft.com/office/drawing/2016/5/13/chartex" xmlns:cx8="http://schemas.microsoft.com/office/drawing/2016/5/14/chartex" xmlns:mc="http://schemas.openxmlformats.org/markup-compatibility/2006" xmlns:aink="http://schemas.microsoft.com/office/drawing/2016/ink" xmlns:am3d="http://schemas.microsoft.com/office/drawing/2017/model3d" xmlns:o="urn:schemas-microsoft-com:office:office" xmlns:oel="http://schemas.microsoft.com/office/2019/extlst" xmlns:r="http://schemas.openxmlformats.org/officeDocument/2006/relationships" xmlns:m="http://schemas.openxmlformats.org/officeDocument/2006/math" xmlns:v="urn:schemas-microsoft-com:vml" xmlns:wp14="http://schemas.microsoft.com/office/word/2010/wordprocessingDrawing" xmlns:wp="http://schemas.openxmlformats.org/drawingml/2006/wordprocessingDrawing" xmlns:w10="urn:schemas-microsoft-com:office:word" xmlns:w="http://schemas.openxmlformats.org/wordprocessingml/2006/main" xmlns:w14="http://schemas.microsoft.com/office/word/2010/wordml" xmlns:w15="http://schemas.microsoft.com/office/word/2012/wordml" xmlns:w16cex="http://schemas.microsoft.com/office/word/2018/wordml/cex" xmlns:w16cid="http://schemas.microsoft.com/office/word/2016/wordml/cid" xmlns:w16="http://schemas.microsoft.com/office/word/2018/wordml" xmlns:w16du="http://schemas.microsoft.com/office/word/2023/wordml/word16du" xmlns:w16sdtdh="http://schemas.microsoft.com/office/word/2020/wordml/sdtdatahash" xmlns:w16se="http://schemas.microsoft.com/office/word/2015/wordml/symex" xmlns:wpg="http://schemas.microsoft.com/office/word/2010/wordprocessingGroup" xmlns:wpi="http://schemas.microsoft.com/office/word/2010/wordprocessingInk" xmlns:wne="http://schemas.microsoft.com/office/word/2006/wordml" xmlns:wps="http://schemas.microsoft.com/office/word/2010/wordprocessingShape" mc:Ignorable="w14 w15 w16se w16cid w16 w16cex w16sdtdh w16du wp14">
+<w:document xmlns:wpc="http://schemas.microsoft.com/office/word/2010/wordprocessingCanvas" xmlns:cx="http://schemas.microsoft.com/office/drawing/2014/chartex" xmlns:cx1="http://schemas.microsoft.com/office/drawing/2015/9/8/chartex" xmlns:cx2="http://schemas.microsoft.com/office/drawing/2015/10/21/chartex" xmlns:cx3="http://schemas.microsoft.com/office/drawing/2016/5/9/chartex" xmlns:cx4="http://schemas.microsoft.com/office/drawing/2016/5/10/chartex" xmlns:cx5="http://schemas.microsoft.com/office/drawing/2016/5/11/chartex" xmlns:cx6="http://schemas.microsoft.com/office/drawing/2016/5/12/chartex" xmlns:cx7="http://schemas.microsoft.com/office/drawing/2016/5/13/chartex" xmlns:cx8="http://schemas.microsoft.com/office/drawing/2016/5/14/chartex" xmlns:mc="http://schemas.openxmlformats.org/markup-compatibility/2006" xmlns:aink="http://schemas.microsoft.com/office/drawing/2016/ink" xmlns:am3d="http://schemas.microsoft.com/office/drawing/2017/model3d" xmlns:o="urn:schemas-microsoft-com:office:office" xmlns:r="http://schemas.openxmlformats.org/officeDocument/2006/relationships" xmlns:m="http://schemas.openxmlformats.org/officeDocument/2006/math" xmlns:v="urn:schemas-microsoft-com:vml" xmlns:wp14="http://schemas.microsoft.com/office/word/2010/wordprocessingDrawing" xmlns:wp="http://schemas.openxmlformats.org/drawingml/2006/wordprocessingDrawing" xmlns:w10="urn:schemas-microsoft-com:office:word" xmlns:w="http://schemas.openxmlformats.org/wordprocessingml/2006/main" xmlns:w14="http://schemas.microsoft.com/office/word/2010/wordml" xmlns:w15="http://schemas.microsoft.com/office/word/2012/wordml" xmlns:w16cex="http://schemas.microsoft.com/office/word/2018/wordml/cex" xmlns:w16cid="http://schemas.microsoft.com/office/word/2016/wordml/cid" xmlns:w16="http://schemas.microsoft.com/office/word/2018/wordml" xmlns:w16sdtdh="http://schemas.microsoft.com/office/word/2020/wordml/sdtdatahash" xmlns:w16se="http://schemas.microsoft.com/office/word/2015/wordml/symex" xmlns:wpg="http://schemas.microsoft.com/office/word/2010/wordprocessingGroup" xmlns:wpi="http://schemas.microsoft.com/office/word/2010/wordprocessingInk" xmlns:wne="http://schemas.microsoft.com/office/word/2006/wordml" xmlns:wps="http://schemas.microsoft.com/office/word/2010/wordprocessingShape" mc:Ignorable="w14 w15 w16se w16cid w16 w16cex w16sdtdh wp14">
   <w:body>
     <w:p>
       <w:pPr>
@@ -1280,7 +1280,19 @@
         <w:rPr>
           <w:bCs/>
         </w:rPr>
-        <w:t xml:space="preserve"> 5 </w:t>
+        <w:t xml:space="preserve"> </w:t>
+      </w:r>
+      <w:r>
+        <w:rPr>
+          <w:bCs/>
+        </w:rPr>
+        <w:t>{PROJECT_DURATION}</w:t>
+      </w:r>
+      <w:r>
+        <w:rPr>
+          <w:bCs/>
+        </w:rPr>
+        <w:t xml:space="preserve"> </w:t>
       </w:r>
       <w:r>
         <w:rPr>
@@ -3047,7 +3059,7 @@
 </file>
 
 <file path=word/endnotes.xml><?xml version="1.0" encoding="utf-8"?>
-<w:endnotes xmlns:wpc="http://schemas.microsoft.com/office/word/2010/wordprocessingCanvas" xmlns:cx="http://schemas.microsoft.com/office/drawing/2014/chartex" xmlns:cx1="http://schemas.microsoft.com/office/drawing/2015/9/8/chartex" xmlns:cx2="http://schemas.microsoft.com/office/drawing/2015/10/21/chartex" xmlns:cx3="http://schemas.microsoft.com/office/drawing/2016/5/9/chartex" xmlns:cx4="http://schemas.microsoft.com/office/drawing/2016/5/10/chartex" xmlns:cx5="http://schemas.microsoft.com/office/drawing/2016/5/11/chartex" xmlns:cx6="http://schemas.microsoft.com/office/drawing/2016/5/12/chartex" xmlns:cx7="http://schemas.microsoft.com/office/drawing/2016/5/13/chartex" xmlns:cx8="http://schemas.microsoft.com/office/drawing/2016/5/14/chartex" xmlns:mc="http://schemas.openxmlformats.org/markup-compatibility/2006" xmlns:aink="http://schemas.microsoft.com/office/drawing/2016/ink" xmlns:am3d="http://schemas.microsoft.com/office/drawing/2017/model3d" xmlns:o="urn:schemas-microsoft-com:office:office" xmlns:oel="http://schemas.microsoft.com/office/2019/extlst" xmlns:r="http://schemas.openxmlformats.org/officeDocument/2006/relationships" xmlns:m="http://schemas.openxmlformats.org/officeDocument/2006/math" xmlns:v="urn:schemas-microsoft-com:vml" xmlns:wp14="http://schemas.microsoft.com/office/word/2010/wordprocessingDrawing" xmlns:wp="http://schemas.openxmlformats.org/drawingml/2006/wordprocessingDrawing" xmlns:w10="urn:schemas-microsoft-com:office:word" xmlns:w="http://schemas.openxmlformats.org/wordprocessingml/2006/main" xmlns:w14="http://schemas.microsoft.com/office/word/2010/wordml" xmlns:w15="http://schemas.microsoft.com/office/word/2012/wordml" xmlns:w16cex="http://schemas.microsoft.com/office/word/2018/wordml/cex" xmlns:w16cid="http://schemas.microsoft.com/office/word/2016/wordml/cid" xmlns:w16="http://schemas.microsoft.com/office/word/2018/wordml" xmlns:w16du="http://schemas.microsoft.com/office/word/2023/wordml/word16du" xmlns:w16sdtdh="http://schemas.microsoft.com/office/word/2020/wordml/sdtdatahash" xmlns:w16se="http://schemas.microsoft.com/office/word/2015/wordml/symex" xmlns:wpg="http://schemas.microsoft.com/office/word/2010/wordprocessingGroup" xmlns:wpi="http://schemas.microsoft.com/office/word/2010/wordprocessingInk" xmlns:wne="http://schemas.microsoft.com/office/word/2006/wordml" xmlns:wps="http://schemas.microsoft.com/office/word/2010/wordprocessingShape" mc:Ignorable="w14 w15 w16se w16cid w16 w16cex w16sdtdh w16du wp14">
+<w:endnotes xmlns:wpc="http://schemas.microsoft.com/office/word/2010/wordprocessingCanvas" xmlns:cx="http://schemas.microsoft.com/office/drawing/2014/chartex" xmlns:cx1="http://schemas.microsoft.com/office/drawing/2015/9/8/chartex" xmlns:cx2="http://schemas.microsoft.com/office/drawing/2015/10/21/chartex" xmlns:cx3="http://schemas.microsoft.com/office/drawing/2016/5/9/chartex" xmlns:cx4="http://schemas.microsoft.com/office/drawing/2016/5/10/chartex" xmlns:cx5="http://schemas.microsoft.com/office/drawing/2016/5/11/chartex" xmlns:cx6="http://schemas.microsoft.com/office/drawing/2016/5/12/chartex" xmlns:cx7="http://schemas.microsoft.com/office/drawing/2016/5/13/chartex" xmlns:cx8="http://schemas.microsoft.com/office/drawing/2016/5/14/chartex" xmlns:mc="http://schemas.openxmlformats.org/markup-compatibility/2006" xmlns:aink="http://schemas.microsoft.com/office/drawing/2016/ink" xmlns:am3d="http://schemas.microsoft.com/office/drawing/2017/model3d" xmlns:o="urn:schemas-microsoft-com:office:office" xmlns:r="http://schemas.openxmlformats.org/officeDocument/2006/relationships" xmlns:m="http://schemas.openxmlformats.org/officeDocument/2006/math" xmlns:v="urn:schemas-microsoft-com:vml" xmlns:wp14="http://schemas.microsoft.com/office/word/2010/wordprocessingDrawing" xmlns:wp="http://schemas.openxmlformats.org/drawingml/2006/wordprocessingDrawing" xmlns:w10="urn:schemas-microsoft-com:office:word" xmlns:w="http://schemas.openxmlformats.org/wordprocessingml/2006/main" xmlns:w14="http://schemas.microsoft.com/office/word/2010/wordml" xmlns:w15="http://schemas.microsoft.com/office/word/2012/wordml" xmlns:w16cex="http://schemas.microsoft.com/office/word/2018/wordml/cex" xmlns:w16cid="http://schemas.microsoft.com/office/word/2016/wordml/cid" xmlns:w16="http://schemas.microsoft.com/office/word/2018/wordml" xmlns:w16sdtdh="http://schemas.microsoft.com/office/word/2020/wordml/sdtdatahash" xmlns:w16se="http://schemas.microsoft.com/office/word/2015/wordml/symex" xmlns:wpg="http://schemas.microsoft.com/office/word/2010/wordprocessingGroup" xmlns:wpi="http://schemas.microsoft.com/office/word/2010/wordprocessingInk" xmlns:wne="http://schemas.microsoft.com/office/word/2006/wordml" xmlns:wps="http://schemas.microsoft.com/office/word/2010/wordprocessingShape" mc:Ignorable="w14 w15 w16se w16cid w16 w16cex w16sdtdh wp14">
   <w:endnote w:type="separator" w:id="-1">
     <w:p>
       <w:r>
@@ -3066,7 +3078,7 @@
 </file>
 
 <file path=word/footer1.xml><?xml version="1.0" encoding="utf-8"?>
-<w:ftr xmlns:wpc="http://schemas.microsoft.com/office/word/2010/wordprocessingCanvas" xmlns:cx="http://schemas.microsoft.com/office/drawing/2014/chartex" xmlns:cx1="http://schemas.microsoft.com/office/drawing/2015/9/8/chartex" xmlns:cx2="http://schemas.microsoft.com/office/drawing/2015/10/21/chartex" xmlns:cx3="http://schemas.microsoft.com/office/drawing/2016/5/9/chartex" xmlns:cx4="http://schemas.microsoft.com/office/drawing/2016/5/10/chartex" xmlns:cx5="http://schemas.microsoft.com/office/drawing/2016/5/11/chartex" xmlns:cx6="http://schemas.microsoft.com/office/drawing/2016/5/12/chartex" xmlns:cx7="http://schemas.microsoft.com/office/drawing/2016/5/13/chartex" xmlns:cx8="http://schemas.microsoft.com/office/drawing/2016/5/14/chartex" xmlns:mc="http://schemas.openxmlformats.org/markup-compatibility/2006" xmlns:aink="http://schemas.microsoft.com/office/drawing/2016/ink" xmlns:am3d="http://schemas.microsoft.com/office/drawing/2017/model3d" xmlns:o="urn:schemas-microsoft-com:office:office" xmlns:oel="http://schemas.microsoft.com/office/2019/extlst" xmlns:r="http://schemas.openxmlformats.org/officeDocument/2006/relationships" xmlns:m="http://schemas.openxmlformats.org/officeDocument/2006/math" xmlns:v="urn:schemas-microsoft-com:vml" xmlns:wp14="http://schemas.microsoft.com/office/word/2010/wordprocessingDrawing" xmlns:wp="http://schemas.openxmlformats.org/drawingml/2006/wordprocessingDrawing" xmlns:w10="urn:schemas-microsoft-com:office:word" xmlns:w="http://schemas.openxmlformats.org/wordprocessingml/2006/main" xmlns:w14="http://schemas.microsoft.com/office/word/2010/wordml" xmlns:w15="http://schemas.microsoft.com/office/word/2012/wordml" xmlns:w16cex="http://schemas.microsoft.com/office/word/2018/wordml/cex" xmlns:w16cid="http://schemas.microsoft.com/office/word/2016/wordml/cid" xmlns:w16="http://schemas.microsoft.com/office/word/2018/wordml" xmlns:w16du="http://schemas.microsoft.com/office/word/2023/wordml/word16du" xmlns:w16sdtdh="http://schemas.microsoft.com/office/word/2020/wordml/sdtdatahash" xmlns:w16se="http://schemas.microsoft.com/office/word/2015/wordml/symex" xmlns:wpg="http://schemas.microsoft.com/office/word/2010/wordprocessingGroup" xmlns:wpi="http://schemas.microsoft.com/office/word/2010/wordprocessingInk" xmlns:wne="http://schemas.microsoft.com/office/word/2006/wordml" xmlns:wps="http://schemas.microsoft.com/office/word/2010/wordprocessingShape" mc:Ignorable="w14 w15 w16se w16cid w16 w16cex w16sdtdh w16du wp14">
+<w:ftr xmlns:wpc="http://schemas.microsoft.com/office/word/2010/wordprocessingCanvas" xmlns:cx="http://schemas.microsoft.com/office/drawing/2014/chartex" xmlns:cx1="http://schemas.microsoft.com/office/drawing/2015/9/8/chartex" xmlns:cx2="http://schemas.microsoft.com/office/drawing/2015/10/21/chartex" xmlns:cx3="http://schemas.microsoft.com/office/drawing/2016/5/9/chartex" xmlns:cx4="http://schemas.microsoft.com/office/drawing/2016/5/10/chartex" xmlns:cx5="http://schemas.microsoft.com/office/drawing/2016/5/11/chartex" xmlns:cx6="http://schemas.microsoft.com/office/drawing/2016/5/12/chartex" xmlns:cx7="http://schemas.microsoft.com/office/drawing/2016/5/13/chartex" xmlns:cx8="http://schemas.microsoft.com/office/drawing/2016/5/14/chartex" xmlns:mc="http://schemas.openxmlformats.org/markup-compatibility/2006" xmlns:aink="http://schemas.microsoft.com/office/drawing/2016/ink" xmlns:am3d="http://schemas.microsoft.com/office/drawing/2017/model3d" xmlns:o="urn:schemas-microsoft-com:office:office" xmlns:r="http://schemas.openxmlformats.org/officeDocument/2006/relationships" xmlns:m="http://schemas.openxmlformats.org/officeDocument/2006/math" xmlns:v="urn:schemas-microsoft-com:vml" xmlns:wp14="http://schemas.microsoft.com/office/word/2010/wordprocessingDrawing" xmlns:wp="http://schemas.openxmlformats.org/drawingml/2006/wordprocessingDrawing" xmlns:w10="urn:schemas-microsoft-com:office:word" xmlns:w="http://schemas.openxmlformats.org/wordprocessingml/2006/main" xmlns:w14="http://schemas.microsoft.com/office/word/2010/wordml" xmlns:w15="http://schemas.microsoft.com/office/word/2012/wordml" xmlns:w16cex="http://schemas.microsoft.com/office/word/2018/wordml/cex" xmlns:w16cid="http://schemas.microsoft.com/office/word/2016/wordml/cid" xmlns:w16="http://schemas.microsoft.com/office/word/2018/wordml" xmlns:w16sdtdh="http://schemas.microsoft.com/office/word/2020/wordml/sdtdatahash" xmlns:w16se="http://schemas.microsoft.com/office/word/2015/wordml/symex" xmlns:wpg="http://schemas.microsoft.com/office/word/2010/wordprocessingGroup" xmlns:wpi="http://schemas.microsoft.com/office/word/2010/wordprocessingInk" xmlns:wne="http://schemas.microsoft.com/office/word/2006/wordml" xmlns:wps="http://schemas.microsoft.com/office/word/2010/wordprocessingShape" mc:Ignorable="w14 w15 w16se w16cid w16 w16cex w16sdtdh wp14">
   <w:p>
     <w:pPr>
       <w:pStyle w:val="Footer"/>
@@ -3100,7 +3112,7 @@
 </file>
 
 <file path=word/footnotes.xml><?xml version="1.0" encoding="utf-8"?>
-<w:footnotes xmlns:wpc="http://schemas.microsoft.com/office/word/2010/wordprocessingCanvas" xmlns:cx="http://schemas.microsoft.com/office/drawing/2014/chartex" xmlns:cx1="http://schemas.microsoft.com/office/drawing/2015/9/8/chartex" xmlns:cx2="http://schemas.microsoft.com/office/drawing/2015/10/21/chartex" xmlns:cx3="http://schemas.microsoft.com/office/drawing/2016/5/9/chartex" xmlns:cx4="http://schemas.microsoft.com/office/drawing/2016/5/10/chartex" xmlns:cx5="http://schemas.microsoft.com/office/drawing/2016/5/11/chartex" xmlns:cx6="http://schemas.microsoft.com/office/drawing/2016/5/12/chartex" xmlns:cx7="http://schemas.microsoft.com/office/drawing/2016/5/13/chartex" xmlns:cx8="http://schemas.microsoft.com/office/drawing/2016/5/14/chartex" xmlns:mc="http://schemas.openxmlformats.org/markup-compatibility/2006" xmlns:aink="http://schemas.microsoft.com/office/drawing/2016/ink" xmlns:am3d="http://schemas.microsoft.com/office/drawing/2017/model3d" xmlns:o="urn:schemas-microsoft-com:office:office" xmlns:oel="http://schemas.microsoft.com/office/2019/extlst" xmlns:r="http://schemas.openxmlformats.org/officeDocument/2006/relationships" xmlns:m="http://schemas.openxmlformats.org/officeDocument/2006/math" xmlns:v="urn:schemas-microsoft-com:vml" xmlns:wp14="http://schemas.microsoft.com/office/word/2010/wordprocessingDrawing" xmlns:wp="http://schemas.openxmlformats.org/drawingml/2006/wordprocessingDrawing" xmlns:w10="urn:schemas-microsoft-com:office:word" xmlns:w="http://schemas.openxmlformats.org/wordprocessingml/2006/main" xmlns:w14="http://schemas.microsoft.com/office/word/2010/wordml" xmlns:w15="http://schemas.microsoft.com/office/word/2012/wordml" xmlns:w16cex="http://schemas.microsoft.com/office/word/2018/wordml/cex" xmlns:w16cid="http://schemas.microsoft.com/office/word/2016/wordml/cid" xmlns:w16="http://schemas.microsoft.com/office/word/2018/wordml" xmlns:w16du="http://schemas.microsoft.com/office/word/2023/wordml/word16du" xmlns:w16sdtdh="http://schemas.microsoft.com/office/word/2020/wordml/sdtdatahash" xmlns:w16se="http://schemas.microsoft.com/office/word/2015/wordml/symex" xmlns:wpg="http://schemas.microsoft.com/office/word/2010/wordprocessingGroup" xmlns:wpi="http://schemas.microsoft.com/office/word/2010/wordprocessingInk" xmlns:wne="http://schemas.microsoft.com/office/word/2006/wordml" xmlns:wps="http://schemas.microsoft.com/office/word/2010/wordprocessingShape" mc:Ignorable="w14 w15 w16se w16cid w16 w16cex w16sdtdh w16du wp14">
+<w:footnotes xmlns:wpc="http://schemas.microsoft.com/office/word/2010/wordprocessingCanvas" xmlns:cx="http://schemas.microsoft.com/office/drawing/2014/chartex" xmlns:cx1="http://schemas.microsoft.com/office/drawing/2015/9/8/chartex" xmlns:cx2="http://schemas.microsoft.com/office/drawing/2015/10/21/chartex" xmlns:cx3="http://schemas.microsoft.com/office/drawing/2016/5/9/chartex" xmlns:cx4="http://schemas.microsoft.com/office/drawing/2016/5/10/chartex" xmlns:cx5="http://schemas.microsoft.com/office/drawing/2016/5/11/chartex" xmlns:cx6="http://schemas.microsoft.com/office/drawing/2016/5/12/chartex" xmlns:cx7="http://schemas.microsoft.com/office/drawing/2016/5/13/chartex" xmlns:cx8="http://schemas.microsoft.com/office/drawing/2016/5/14/chartex" xmlns:mc="http://schemas.openxmlformats.org/markup-compatibility/2006" xmlns:aink="http://schemas.microsoft.com/office/drawing/2016/ink" xmlns:am3d="http://schemas.microsoft.com/office/drawing/2017/model3d" xmlns:o="urn:schemas-microsoft-com:office:office" xmlns:r="http://schemas.openxmlformats.org/officeDocument/2006/relationships" xmlns:m="http://schemas.openxmlformats.org/officeDocument/2006/math" xmlns:v="urn:schemas-microsoft-com:vml" xmlns:wp14="http://schemas.microsoft.com/office/word/2010/wordprocessingDrawing" xmlns:wp="http://schemas.openxmlformats.org/drawingml/2006/wordprocessingDrawing" xmlns:w10="urn:schemas-microsoft-com:office:word" xmlns:w="http://schemas.openxmlformats.org/wordprocessingml/2006/main" xmlns:w14="http://schemas.microsoft.com/office/word/2010/wordml" xmlns:w15="http://schemas.microsoft.com/office/word/2012/wordml" xmlns:w16cex="http://schemas.microsoft.com/office/word/2018/wordml/cex" xmlns:w16cid="http://schemas.microsoft.com/office/word/2016/wordml/cid" xmlns:w16="http://schemas.microsoft.com/office/word/2018/wordml" xmlns:w16sdtdh="http://schemas.microsoft.com/office/word/2020/wordml/sdtdatahash" xmlns:w16se="http://schemas.microsoft.com/office/word/2015/wordml/symex" xmlns:wpg="http://schemas.microsoft.com/office/word/2010/wordprocessingGroup" xmlns:wpi="http://schemas.microsoft.com/office/word/2010/wordprocessingInk" xmlns:wne="http://schemas.microsoft.com/office/word/2006/wordml" xmlns:wps="http://schemas.microsoft.com/office/word/2010/wordprocessingShape" mc:Ignorable="w14 w15 w16se w16cid w16 w16cex w16sdtdh wp14">
   <w:footnote w:type="separator" w:id="-1">
     <w:p>
       <w:r>
@@ -3119,7 +3131,7 @@
 </file>
 
 <file path=word/numbering.xml><?xml version="1.0" encoding="utf-8"?>
-<w:numbering xmlns:wpc="http://schemas.microsoft.com/office/word/2010/wordprocessingCanvas" xmlns:cx="http://schemas.microsoft.com/office/drawing/2014/chartex" xmlns:cx1="http://schemas.microsoft.com/office/drawing/2015/9/8/chartex" xmlns:cx2="http://schemas.microsoft.com/office/drawing/2015/10/21/chartex" xmlns:cx3="http://schemas.microsoft.com/office/drawing/2016/5/9/chartex" xmlns:cx4="http://schemas.microsoft.com/office/drawing/2016/5/10/chartex" xmlns:cx5="http://schemas.microsoft.com/office/drawing/2016/5/11/chartex" xmlns:cx6="http://schemas.microsoft.com/office/drawing/2016/5/12/chartex" xmlns:cx7="http://schemas.microsoft.com/office/drawing/2016/5/13/chartex" xmlns:cx8="http://schemas.microsoft.com/office/drawing/2016/5/14/chartex" xmlns:mc="http://schemas.openxmlformats.org/markup-compatibility/2006" xmlns:aink="http://schemas.microsoft.com/office/drawing/2016/ink" xmlns:am3d="http://schemas.microsoft.com/office/drawing/2017/model3d" xmlns:o="urn:schemas-microsoft-com:office:office" xmlns:oel="http://schemas.microsoft.com/office/2019/extlst" xmlns:r="http://schemas.openxmlformats.org/officeDocument/2006/relationships" xmlns:m="http://schemas.openxmlformats.org/officeDocument/2006/math" xmlns:v="urn:schemas-microsoft-com:vml" xmlns:wp14="http://schemas.microsoft.com/office/word/2010/wordprocessingDrawing" xmlns:wp="http://schemas.openxmlformats.org/drawingml/2006/wordprocessingDrawing" xmlns:w10="urn:schemas-microsoft-com:office:word" xmlns:w="http://schemas.openxmlformats.org/wordprocessingml/2006/main" xmlns:w14="http://schemas.microsoft.com/office/word/2010/wordml" xmlns:w15="http://schemas.microsoft.com/office/word/2012/wordml" xmlns:w16cex="http://schemas.microsoft.com/office/word/2018/wordml/cex" xmlns:w16cid="http://schemas.microsoft.com/office/word/2016/wordml/cid" xmlns:w16="http://schemas.microsoft.com/office/word/2018/wordml" xmlns:w16du="http://schemas.microsoft.com/office/word/2023/wordml/word16du" xmlns:w16sdtdh="http://schemas.microsoft.com/office/word/2020/wordml/sdtdatahash" xmlns:w16se="http://schemas.microsoft.com/office/word/2015/wordml/symex" xmlns:wpg="http://schemas.microsoft.com/office/word/2010/wordprocessingGroup" xmlns:wpi="http://schemas.microsoft.com/office/word/2010/wordprocessingInk" xmlns:wne="http://schemas.microsoft.com/office/word/2006/wordml" xmlns:wps="http://schemas.microsoft.com/office/word/2010/wordprocessingShape" mc:Ignorable="w14 w15 w16se w16cid w16 w16cex w16sdtdh w16du wp14">
+<w:numbering xmlns:wpc="http://schemas.microsoft.com/office/word/2010/wordprocessingCanvas" xmlns:cx="http://schemas.microsoft.com/office/drawing/2014/chartex" xmlns:cx1="http://schemas.microsoft.com/office/drawing/2015/9/8/chartex" xmlns:cx2="http://schemas.microsoft.com/office/drawing/2015/10/21/chartex" xmlns:cx3="http://schemas.microsoft.com/office/drawing/2016/5/9/chartex" xmlns:cx4="http://schemas.microsoft.com/office/drawing/2016/5/10/chartex" xmlns:cx5="http://schemas.microsoft.com/office/drawing/2016/5/11/chartex" xmlns:cx6="http://schemas.microsoft.com/office/drawing/2016/5/12/chartex" xmlns:cx7="http://schemas.microsoft.com/office/drawing/2016/5/13/chartex" xmlns:cx8="http://schemas.microsoft.com/office/drawing/2016/5/14/chartex" xmlns:mc="http://schemas.openxmlformats.org/markup-compatibility/2006" xmlns:aink="http://schemas.microsoft.com/office/drawing/2016/ink" xmlns:am3d="http://schemas.microsoft.com/office/drawing/2017/model3d" xmlns:o="urn:schemas-microsoft-com:office:office" xmlns:r="http://schemas.openxmlformats.org/officeDocument/2006/relationships" xmlns:m="http://schemas.openxmlformats.org/officeDocument/2006/math" xmlns:v="urn:schemas-microsoft-com:vml" xmlns:wp14="http://schemas.microsoft.com/office/word/2010/wordprocessingDrawing" xmlns:wp="http://schemas.openxmlformats.org/drawingml/2006/wordprocessingDrawing" xmlns:w10="urn:schemas-microsoft-com:office:word" xmlns:w="http://schemas.openxmlformats.org/wordprocessingml/2006/main" xmlns:w14="http://schemas.microsoft.com/office/word/2010/wordml" xmlns:w15="http://schemas.microsoft.com/office/word/2012/wordml" xmlns:w16cex="http://schemas.microsoft.com/office/word/2018/wordml/cex" xmlns:w16cid="http://schemas.microsoft.com/office/word/2016/wordml/cid" xmlns:w16="http://schemas.microsoft.com/office/word/2018/wordml" xmlns:w16sdtdh="http://schemas.microsoft.com/office/word/2020/wordml/sdtdatahash" xmlns:w16se="http://schemas.microsoft.com/office/word/2015/wordml/symex" xmlns:wpg="http://schemas.microsoft.com/office/word/2010/wordprocessingGroup" xmlns:wpi="http://schemas.microsoft.com/office/word/2010/wordprocessingInk" xmlns:wne="http://schemas.microsoft.com/office/word/2006/wordml" xmlns:wps="http://schemas.microsoft.com/office/word/2010/wordprocessingShape" mc:Ignorable="w14 w15 w16se w16cid w16 w16cex w16sdtdh wp14">
   <w:abstractNum w:abstractNumId="0" w15:restartNumberingAfterBreak="0">
     <w:nsid w:val="FFFFFF1D"/>
     <w:multiLevelType w:val="multilevel"/>
@@ -4857,49 +4869,49 @@
       </w:pPr>
     </w:lvl>
   </w:abstractNum>
-  <w:num w:numId="1" w16cid:durableId="3095140">
+  <w:num w:numId="1">
     <w:abstractNumId w:val="6"/>
   </w:num>
-  <w:num w:numId="2" w16cid:durableId="892348888">
+  <w:num w:numId="2">
     <w:abstractNumId w:val="12"/>
   </w:num>
-  <w:num w:numId="3" w16cid:durableId="1436173738">
+  <w:num w:numId="3">
     <w:abstractNumId w:val="11"/>
   </w:num>
-  <w:num w:numId="4" w16cid:durableId="1495681376">
+  <w:num w:numId="4">
     <w:abstractNumId w:val="3"/>
   </w:num>
-  <w:num w:numId="5" w16cid:durableId="813765089">
+  <w:num w:numId="5">
     <w:abstractNumId w:val="7"/>
   </w:num>
-  <w:num w:numId="6" w16cid:durableId="148600052">
+  <w:num w:numId="6">
     <w:abstractNumId w:val="2"/>
   </w:num>
-  <w:num w:numId="7" w16cid:durableId="1647005846">
+  <w:num w:numId="7">
     <w:abstractNumId w:val="1"/>
   </w:num>
-  <w:num w:numId="8" w16cid:durableId="936137982">
+  <w:num w:numId="8">
     <w:abstractNumId w:val="16"/>
   </w:num>
-  <w:num w:numId="9" w16cid:durableId="1279530499">
+  <w:num w:numId="9">
     <w:abstractNumId w:val="10"/>
   </w:num>
-  <w:num w:numId="10" w16cid:durableId="922495366">
+  <w:num w:numId="10">
     <w:abstractNumId w:val="8"/>
   </w:num>
-  <w:num w:numId="11" w16cid:durableId="998385855">
+  <w:num w:numId="11">
     <w:abstractNumId w:val="13"/>
   </w:num>
-  <w:num w:numId="12" w16cid:durableId="1669212084">
+  <w:num w:numId="12">
     <w:abstractNumId w:val="4"/>
   </w:num>
-  <w:num w:numId="13" w16cid:durableId="2018843406">
+  <w:num w:numId="13">
     <w:abstractNumId w:val="15"/>
   </w:num>
-  <w:num w:numId="14" w16cid:durableId="1139155650">
+  <w:num w:numId="14">
     <w:abstractNumId w:val="0"/>
   </w:num>
-  <w:num w:numId="15" w16cid:durableId="527259862">
+  <w:num w:numId="15">
     <w:abstractNumId w:val="5"/>
     <w:lvlOverride w:ilvl="0">
       <w:startOverride w:val="1"/>
@@ -4929,17 +4941,17 @@
       <w:startOverride w:val="1"/>
     </w:lvlOverride>
   </w:num>
-  <w:num w:numId="16" w16cid:durableId="295574783">
+  <w:num w:numId="16">
     <w:abstractNumId w:val="9"/>
   </w:num>
-  <w:num w:numId="17" w16cid:durableId="1853370625">
+  <w:num w:numId="17">
     <w:abstractNumId w:val="14"/>
   </w:num>
 </w:numbering>
 </file>
 
 <file path=word/styles.xml><?xml version="1.0" encoding="utf-8"?>
-<w:styles xmlns:mc="http://schemas.openxmlformats.org/markup-compatibility/2006" xmlns:r="http://schemas.openxmlformats.org/officeDocument/2006/relationships" xmlns:w="http://schemas.openxmlformats.org/wordprocessingml/2006/main" xmlns:w14="http://schemas.microsoft.com/office/word/2010/wordml" xmlns:w15="http://schemas.microsoft.com/office/word/2012/wordml" xmlns:w16cex="http://schemas.microsoft.com/office/word/2018/wordml/cex" xmlns:w16cid="http://schemas.microsoft.com/office/word/2016/wordml/cid" xmlns:w16="http://schemas.microsoft.com/office/word/2018/wordml" xmlns:w16du="http://schemas.microsoft.com/office/word/2023/wordml/word16du" xmlns:w16sdtdh="http://schemas.microsoft.com/office/word/2020/wordml/sdtdatahash" xmlns:w16se="http://schemas.microsoft.com/office/word/2015/wordml/symex" mc:Ignorable="w14 w15 w16se w16cid w16 w16cex w16sdtdh w16du">
+<w:styles xmlns:mc="http://schemas.openxmlformats.org/markup-compatibility/2006" xmlns:r="http://schemas.openxmlformats.org/officeDocument/2006/relationships" xmlns:w="http://schemas.openxmlformats.org/wordprocessingml/2006/main" xmlns:w14="http://schemas.microsoft.com/office/word/2010/wordml" xmlns:w15="http://schemas.microsoft.com/office/word/2012/wordml" xmlns:w16cex="http://schemas.microsoft.com/office/word/2018/wordml/cex" xmlns:w16cid="http://schemas.microsoft.com/office/word/2016/wordml/cid" xmlns:w16="http://schemas.microsoft.com/office/word/2018/wordml" xmlns:w16sdtdh="http://schemas.microsoft.com/office/word/2020/wordml/sdtdatahash" xmlns:w16se="http://schemas.microsoft.com/office/word/2015/wordml/symex" mc:Ignorable="w14 w15 w16se w16cid w16 w16cex w16sdtdh">
   <w:docDefaults>
     <w:rPrDefault>
       <w:rPr>

</xml_diff>